<commit_message>
formatted werkhandleiding and added sequence diagram
</commit_message>
<xml_diff>
--- a/start_documents/Werkhandleiding stage.docx
+++ b/start_documents/Werkhandleiding stage.docx
@@ -54,7 +54,7 @@
         <w:pStyle w:val="Kop1"/>
         <w:jc w:val="center"/>
       </w:pPr>
-      <w:bookmarkStart w:id="0" w:name="_Toc222386882"/>
+      <w:bookmarkStart w:id="0" w:name="_Toc222390851"/>
       <w:r>
         <w:lastRenderedPageBreak/>
         <w:t>Inhoudsopgave</w:t>
@@ -74,6 +74,15 @@
     </w:p>
     <w:sdt>
       <w:sdtPr>
+        <w:rPr>
+          <w:rFonts w:asciiTheme="minorHAnsi" w:eastAsiaTheme="minorHAnsi" w:hAnsiTheme="minorHAnsi" w:cstheme="minorBidi"/>
+          <w:color w:val="auto"/>
+          <w:kern w:val="2"/>
+          <w:sz w:val="24"/>
+          <w:szCs w:val="24"/>
+          <w:lang w:eastAsia="en-US"/>
+          <w14:ligatures w14:val="standardContextual"/>
+        </w:rPr>
         <w:id w:val="-1385791087"/>
         <w:docPartObj>
           <w:docPartGallery w:val="Table of Contents"/>
@@ -82,15 +91,8 @@
       </w:sdtPr>
       <w:sdtEndPr>
         <w:rPr>
-          <w:rFonts w:asciiTheme="minorHAnsi" w:eastAsiaTheme="minorHAnsi" w:hAnsiTheme="minorHAnsi" w:cstheme="minorBidi"/>
           <w:b/>
           <w:bCs/>
-          <w:color w:val="auto"/>
-          <w:kern w:val="2"/>
-          <w:sz w:val="24"/>
-          <w:szCs w:val="24"/>
-          <w:lang w:eastAsia="en-US"/>
-          <w14:ligatures w14:val="standardContextual"/>
         </w:rPr>
       </w:sdtEndPr>
       <w:sdtContent>
@@ -123,7 +125,7 @@
           <w:r>
             <w:fldChar w:fldCharType="separate"/>
           </w:r>
-          <w:hyperlink w:anchor="_Toc222386882" w:history="1">
+          <w:hyperlink w:anchor="_Toc222390851" w:history="1">
             <w:r>
               <w:rPr>
                 <w:rStyle w:val="Hyperlink"/>
@@ -150,7 +152,7 @@
                 <w:noProof/>
                 <w:webHidden/>
               </w:rPr>
-              <w:instrText xml:space="preserve"> PAGEREF _Toc222386882 \h </w:instrText>
+              <w:instrText xml:space="preserve"> PAGEREF _Toc222390851 \h </w:instrText>
             </w:r>
             <w:r>
               <w:rPr>
@@ -193,7 +195,7 @@
               <w:lang w:eastAsia="nl-NL"/>
             </w:rPr>
           </w:pPr>
-          <w:hyperlink w:anchor="_Toc222386883" w:history="1">
+          <w:hyperlink w:anchor="_Toc222390852" w:history="1">
             <w:r>
               <w:rPr>
                 <w:rStyle w:val="Hyperlink"/>
@@ -220,7 +222,7 @@
                 <w:noProof/>
                 <w:webHidden/>
               </w:rPr>
-              <w:instrText xml:space="preserve"> PAGEREF _Toc222386883 \h </w:instrText>
+              <w:instrText xml:space="preserve"> PAGEREF _Toc222390852 \h </w:instrText>
             </w:r>
             <w:r>
               <w:rPr>
@@ -263,7 +265,7 @@
               <w:lang w:eastAsia="nl-NL"/>
             </w:rPr>
           </w:pPr>
-          <w:hyperlink w:anchor="_Toc222386884" w:history="1">
+          <w:hyperlink w:anchor="_Toc222390853" w:history="1">
             <w:r>
               <w:rPr>
                 <w:rStyle w:val="Hyperlink"/>
@@ -290,7 +292,7 @@
                 <w:noProof/>
                 <w:webHidden/>
               </w:rPr>
-              <w:instrText xml:space="preserve"> PAGEREF _Toc222386884 \h </w:instrText>
+              <w:instrText xml:space="preserve"> PAGEREF _Toc222390853 \h </w:instrText>
             </w:r>
             <w:r>
               <w:rPr>
@@ -333,7 +335,7 @@
               <w:lang w:eastAsia="nl-NL"/>
             </w:rPr>
           </w:pPr>
-          <w:hyperlink w:anchor="_Toc222386885" w:history="1">
+          <w:hyperlink w:anchor="_Toc222390854" w:history="1">
             <w:r>
               <w:rPr>
                 <w:rStyle w:val="Hyperlink"/>
@@ -360,7 +362,7 @@
                 <w:noProof/>
                 <w:webHidden/>
               </w:rPr>
-              <w:instrText xml:space="preserve"> PAGEREF _Toc222386885 \h </w:instrText>
+              <w:instrText xml:space="preserve"> PAGEREF _Toc222390854 \h </w:instrText>
             </w:r>
             <w:r>
               <w:rPr>
@@ -403,7 +405,7 @@
               <w:lang w:eastAsia="nl-NL"/>
             </w:rPr>
           </w:pPr>
-          <w:hyperlink w:anchor="_Toc222386886" w:history="1">
+          <w:hyperlink w:anchor="_Toc222390855" w:history="1">
             <w:r>
               <w:rPr>
                 <w:rStyle w:val="Hyperlink"/>
@@ -430,7 +432,7 @@
                 <w:noProof/>
                 <w:webHidden/>
               </w:rPr>
-              <w:instrText xml:space="preserve"> PAGEREF _Toc222386886 \h </w:instrText>
+              <w:instrText xml:space="preserve"> PAGEREF _Toc222390855 \h </w:instrText>
             </w:r>
             <w:r>
               <w:rPr>
@@ -473,7 +475,7 @@
               <w:lang w:eastAsia="nl-NL"/>
             </w:rPr>
           </w:pPr>
-          <w:hyperlink w:anchor="_Toc222386887" w:history="1">
+          <w:hyperlink w:anchor="_Toc222390856" w:history="1">
             <w:r>
               <w:rPr>
                 <w:rStyle w:val="Hyperlink"/>
@@ -500,7 +502,7 @@
                 <w:noProof/>
                 <w:webHidden/>
               </w:rPr>
-              <w:instrText xml:space="preserve"> PAGEREF _Toc222386887 \h </w:instrText>
+              <w:instrText xml:space="preserve"> PAGEREF _Toc222390856 \h </w:instrText>
             </w:r>
             <w:r>
               <w:rPr>
@@ -543,7 +545,7 @@
               <w:lang w:eastAsia="nl-NL"/>
             </w:rPr>
           </w:pPr>
-          <w:hyperlink w:anchor="_Toc222386888" w:history="1">
+          <w:hyperlink w:anchor="_Toc222390857" w:history="1">
             <w:r>
               <w:rPr>
                 <w:rStyle w:val="Hyperlink"/>
@@ -570,7 +572,7 @@
                 <w:noProof/>
                 <w:webHidden/>
               </w:rPr>
-              <w:instrText xml:space="preserve"> PAGEREF _Toc222386888 \h </w:instrText>
+              <w:instrText xml:space="preserve"> PAGEREF _Toc222390857 \h </w:instrText>
             </w:r>
             <w:r>
               <w:rPr>
@@ -613,7 +615,7 @@
               <w:lang w:eastAsia="nl-NL"/>
             </w:rPr>
           </w:pPr>
-          <w:hyperlink w:anchor="_Toc222386889" w:history="1">
+          <w:hyperlink w:anchor="_Toc222390858" w:history="1">
             <w:r>
               <w:rPr>
                 <w:rStyle w:val="Hyperlink"/>
@@ -640,7 +642,7 @@
                 <w:noProof/>
                 <w:webHidden/>
               </w:rPr>
-              <w:instrText xml:space="preserve"> PAGEREF _Toc222386889 \h </w:instrText>
+              <w:instrText xml:space="preserve"> PAGEREF _Toc222390858 \h </w:instrText>
             </w:r>
             <w:r>
               <w:rPr>
@@ -683,7 +685,7 @@
               <w:lang w:eastAsia="nl-NL"/>
             </w:rPr>
           </w:pPr>
-          <w:hyperlink w:anchor="_Toc222386890" w:history="1">
+          <w:hyperlink w:anchor="_Toc222390859" w:history="1">
             <w:r>
               <w:rPr>
                 <w:rStyle w:val="Hyperlink"/>
@@ -710,7 +712,7 @@
                 <w:noProof/>
                 <w:webHidden/>
               </w:rPr>
-              <w:instrText xml:space="preserve"> PAGEREF _Toc222386890 \h </w:instrText>
+              <w:instrText xml:space="preserve"> PAGEREF _Toc222390859 \h </w:instrText>
             </w:r>
             <w:r>
               <w:rPr>
@@ -753,7 +755,7 @@
               <w:lang w:eastAsia="nl-NL"/>
             </w:rPr>
           </w:pPr>
-          <w:hyperlink w:anchor="_Toc222386891" w:history="1">
+          <w:hyperlink w:anchor="_Toc222390860" w:history="1">
             <w:r>
               <w:rPr>
                 <w:rStyle w:val="Hyperlink"/>
@@ -780,7 +782,7 @@
                 <w:noProof/>
                 <w:webHidden/>
               </w:rPr>
-              <w:instrText xml:space="preserve"> PAGEREF _Toc222386891 \h </w:instrText>
+              <w:instrText xml:space="preserve"> PAGEREF _Toc222390860 \h </w:instrText>
             </w:r>
             <w:r>
               <w:rPr>
@@ -823,7 +825,7 @@
               <w:lang w:eastAsia="nl-NL"/>
             </w:rPr>
           </w:pPr>
-          <w:hyperlink w:anchor="_Toc222386892" w:history="1">
+          <w:hyperlink w:anchor="_Toc222390861" w:history="1">
             <w:r>
               <w:rPr>
                 <w:rStyle w:val="Hyperlink"/>
@@ -850,7 +852,7 @@
                 <w:noProof/>
                 <w:webHidden/>
               </w:rPr>
-              <w:instrText xml:space="preserve"> PAGEREF _Toc222386892 \h </w:instrText>
+              <w:instrText xml:space="preserve"> PAGEREF _Toc222390861 \h </w:instrText>
             </w:r>
             <w:r>
               <w:rPr>
@@ -893,7 +895,7 @@
               <w:lang w:eastAsia="nl-NL"/>
             </w:rPr>
           </w:pPr>
-          <w:hyperlink w:anchor="_Toc222386893" w:history="1">
+          <w:hyperlink w:anchor="_Toc222390862" w:history="1">
             <w:r>
               <w:rPr>
                 <w:rStyle w:val="Hyperlink"/>
@@ -920,7 +922,7 @@
                 <w:noProof/>
                 <w:webHidden/>
               </w:rPr>
-              <w:instrText xml:space="preserve"> PAGEREF _Toc222386893 \h </w:instrText>
+              <w:instrText xml:space="preserve"> PAGEREF _Toc222390862 \h </w:instrText>
             </w:r>
             <w:r>
               <w:rPr>
@@ -963,7 +965,7 @@
               <w:lang w:eastAsia="nl-NL"/>
             </w:rPr>
           </w:pPr>
-          <w:hyperlink w:anchor="_Toc222386894" w:history="1">
+          <w:hyperlink w:anchor="_Toc222390863" w:history="1">
             <w:r>
               <w:rPr>
                 <w:rStyle w:val="Hyperlink"/>
@@ -990,7 +992,7 @@
                 <w:noProof/>
                 <w:webHidden/>
               </w:rPr>
-              <w:instrText xml:space="preserve"> PAGEREF _Toc222386894 \h </w:instrText>
+              <w:instrText xml:space="preserve"> PAGEREF _Toc222390863 \h </w:instrText>
             </w:r>
             <w:r>
               <w:rPr>
@@ -1033,7 +1035,7 @@
               <w:lang w:eastAsia="nl-NL"/>
             </w:rPr>
           </w:pPr>
-          <w:hyperlink w:anchor="_Toc222386895" w:history="1">
+          <w:hyperlink w:anchor="_Toc222390864" w:history="1">
             <w:r>
               <w:rPr>
                 <w:rStyle w:val="Hyperlink"/>
@@ -1060,7 +1062,7 @@
                 <w:noProof/>
                 <w:webHidden/>
               </w:rPr>
-              <w:instrText xml:space="preserve"> PAGEREF _Toc222386895 \h </w:instrText>
+              <w:instrText xml:space="preserve"> PAGEREF _Toc222390864 \h </w:instrText>
             </w:r>
             <w:r>
               <w:rPr>
@@ -1103,7 +1105,7 @@
               <w:lang w:eastAsia="nl-NL"/>
             </w:rPr>
           </w:pPr>
-          <w:hyperlink w:anchor="_Toc222386896" w:history="1">
+          <w:hyperlink w:anchor="_Toc222390865" w:history="1">
             <w:r>
               <w:rPr>
                 <w:rStyle w:val="Hyperlink"/>
@@ -1130,7 +1132,7 @@
                 <w:noProof/>
                 <w:webHidden/>
               </w:rPr>
-              <w:instrText xml:space="preserve"> PAGEREF _Toc222386896 \h </w:instrText>
+              <w:instrText xml:space="preserve"> PAGEREF _Toc222390865 \h </w:instrText>
             </w:r>
             <w:r>
               <w:rPr>
@@ -1173,7 +1175,7 @@
               <w:lang w:eastAsia="nl-NL"/>
             </w:rPr>
           </w:pPr>
-          <w:hyperlink w:anchor="_Toc222386897" w:history="1">
+          <w:hyperlink w:anchor="_Toc222390866" w:history="1">
             <w:r>
               <w:rPr>
                 <w:rStyle w:val="Hyperlink"/>
@@ -1200,7 +1202,7 @@
                 <w:noProof/>
                 <w:webHidden/>
               </w:rPr>
-              <w:instrText xml:space="preserve"> PAGEREF _Toc222386897 \h </w:instrText>
+              <w:instrText xml:space="preserve"> PAGEREF _Toc222390866 \h </w:instrText>
             </w:r>
             <w:r>
               <w:rPr>
@@ -1243,7 +1245,7 @@
               <w:lang w:eastAsia="nl-NL"/>
             </w:rPr>
           </w:pPr>
-          <w:hyperlink w:anchor="_Toc222386898" w:history="1">
+          <w:hyperlink w:anchor="_Toc222390867" w:history="1">
             <w:r>
               <w:rPr>
                 <w:rStyle w:val="Hyperlink"/>
@@ -1270,7 +1272,7 @@
                 <w:noProof/>
                 <w:webHidden/>
               </w:rPr>
-              <w:instrText xml:space="preserve"> PAGEREF _Toc222386898 \h </w:instrText>
+              <w:instrText xml:space="preserve"> PAGEREF _Toc222390867 \h </w:instrText>
             </w:r>
             <w:r>
               <w:rPr>
@@ -1313,7 +1315,7 @@
               <w:lang w:eastAsia="nl-NL"/>
             </w:rPr>
           </w:pPr>
-          <w:hyperlink w:anchor="_Toc222386899" w:history="1">
+          <w:hyperlink w:anchor="_Toc222390868" w:history="1">
             <w:r>
               <w:rPr>
                 <w:rStyle w:val="Hyperlink"/>
@@ -1340,7 +1342,7 @@
                 <w:noProof/>
                 <w:webHidden/>
               </w:rPr>
-              <w:instrText xml:space="preserve"> PAGEREF _Toc222386899 \h </w:instrText>
+              <w:instrText xml:space="preserve"> PAGEREF _Toc222390868 \h </w:instrText>
             </w:r>
             <w:r>
               <w:rPr>
@@ -1383,7 +1385,7 @@
               <w:lang w:eastAsia="nl-NL"/>
             </w:rPr>
           </w:pPr>
-          <w:hyperlink w:anchor="_Toc222386900" w:history="1">
+          <w:hyperlink w:anchor="_Toc222390869" w:history="1">
             <w:r>
               <w:rPr>
                 <w:rStyle w:val="Hyperlink"/>
@@ -1410,7 +1412,7 @@
                 <w:noProof/>
                 <w:webHidden/>
               </w:rPr>
-              <w:instrText xml:space="preserve"> PAGEREF _Toc222386900 \h </w:instrText>
+              <w:instrText xml:space="preserve"> PAGEREF _Toc222390869 \h </w:instrText>
             </w:r>
             <w:r>
               <w:rPr>
@@ -1498,55 +1500,37 @@
     </w:p>
     <w:p>
       <w:pPr>
-        <w:jc w:val="center"/>
+        <w:pStyle w:val="Kop1"/>
+      </w:pPr>
+      <w:bookmarkStart w:id="1" w:name="_Toc222390852"/>
+      <w:r>
+        <w:lastRenderedPageBreak/>
+        <w:t>Architectuur</w:t>
+      </w:r>
+      <w:bookmarkEnd w:id="1"/>
+    </w:p>
+    <w:p>
+      <w:r>
+        <w:t xml:space="preserve">Voor de architectuur kies ik voor de </w:t>
+      </w:r>
+      <w:r>
         <w:rPr>
           <w:b/>
           <w:bCs/>
-          <w:sz w:val="48"/>
-          <w:szCs w:val="48"/>
         </w:rPr>
-      </w:pPr>
-    </w:p>
-    <w:p>
-      <w:pPr>
-        <w:jc w:val="center"/>
+        <w:t xml:space="preserve">5-layer </w:t>
+      </w:r>
+      <w:proofErr w:type="spellStart"/>
+      <w:r>
         <w:rPr>
           <w:b/>
           <w:bCs/>
-          <w:sz w:val="48"/>
-          <w:szCs w:val="48"/>
         </w:rPr>
-      </w:pPr>
-    </w:p>
-    <w:p>
-      <w:pPr>
-        <w:pStyle w:val="Kop1"/>
-      </w:pPr>
-      <w:bookmarkStart w:id="1" w:name="_Toc222386883"/>
-      <w:r>
-        <w:t>Architectuur</w:t>
-      </w:r>
-      <w:bookmarkEnd w:id="1"/>
-    </w:p>
-    <w:p>
-      <w:r>
-        <w:t xml:space="preserve">Voor de architectuur kies ik voor de “5 </w:t>
-      </w:r>
-      <w:proofErr w:type="spellStart"/>
-      <w:r>
-        <w:t>layer</w:t>
-      </w:r>
-      <w:proofErr w:type="spellEnd"/>
-      <w:r>
-        <w:t xml:space="preserve"> </w:t>
-      </w:r>
-      <w:proofErr w:type="spellStart"/>
-      <w:r>
         <w:t>architecture</w:t>
       </w:r>
       <w:proofErr w:type="spellEnd"/>
       <w:r>
-        <w:t xml:space="preserve">” wat betekend dat ik ga werken met 5 lagen in de </w:t>
+        <w:t xml:space="preserve">, wat betekent dat de </w:t>
       </w:r>
       <w:proofErr w:type="spellStart"/>
       <w:r>
@@ -1554,23 +1538,14 @@
       </w:r>
       <w:proofErr w:type="spellEnd"/>
       <w:r>
-        <w:t xml:space="preserve">. Deze 5 </w:t>
-      </w:r>
-      <w:proofErr w:type="spellStart"/>
-      <w:r>
-        <w:t>layers</w:t>
-      </w:r>
-      <w:proofErr w:type="spellEnd"/>
-      <w:r>
-        <w:t xml:space="preserve"> zijn:</w:t>
-      </w:r>
-    </w:p>
-    <w:p>
-      <w:pPr>
-        <w:pStyle w:val="Lijstalinea"/>
+        <w:t xml:space="preserve"> wordt opgebouwd uit vijf duidelijk gescheiden lagen. Deze lagen zijn:</w:t>
+      </w:r>
+    </w:p>
+    <w:p>
+      <w:pPr>
         <w:numPr>
           <w:ilvl w:val="0"/>
-          <w:numId w:val="1"/>
+          <w:numId w:val="2"/>
         </w:numPr>
       </w:pPr>
       <w:r>
@@ -1587,10 +1562,9 @@
     </w:p>
     <w:p>
       <w:pPr>
-        <w:pStyle w:val="Lijstalinea"/>
         <w:numPr>
           <w:ilvl w:val="0"/>
-          <w:numId w:val="1"/>
+          <w:numId w:val="2"/>
         </w:numPr>
       </w:pPr>
       <w:r>
@@ -1607,10 +1581,9 @@
     </w:p>
     <w:p>
       <w:pPr>
-        <w:pStyle w:val="Lijstalinea"/>
         <w:numPr>
           <w:ilvl w:val="0"/>
-          <w:numId w:val="1"/>
+          <w:numId w:val="2"/>
         </w:numPr>
       </w:pPr>
       <w:r>
@@ -1624,10 +1597,9 @@
     </w:p>
     <w:p>
       <w:pPr>
-        <w:pStyle w:val="Lijstalinea"/>
         <w:numPr>
           <w:ilvl w:val="0"/>
-          <w:numId w:val="1"/>
+          <w:numId w:val="2"/>
         </w:numPr>
       </w:pPr>
       <w:r>
@@ -1641,10 +1613,9 @@
     </w:p>
     <w:p>
       <w:pPr>
-        <w:pStyle w:val="Lijstalinea"/>
         <w:numPr>
           <w:ilvl w:val="0"/>
-          <w:numId w:val="1"/>
+          <w:numId w:val="2"/>
         </w:numPr>
       </w:pPr>
       <w:r>
@@ -1658,39 +1629,46 @@
     </w:p>
     <w:p>
       <w:r>
-        <w:t xml:space="preserve">Deze “5 </w:t>
-      </w:r>
-      <w:proofErr w:type="spellStart"/>
-      <w:r>
-        <w:t>layer</w:t>
-      </w:r>
-      <w:proofErr w:type="spellEnd"/>
-      <w:r>
-        <w:t xml:space="preserve"> </w:t>
-      </w:r>
-      <w:proofErr w:type="spellStart"/>
-      <w:r>
-        <w:t>architecture</w:t>
-      </w:r>
-      <w:proofErr w:type="spellEnd"/>
-      <w:r>
-        <w:t xml:space="preserve">” zorgt voor </w:t>
-      </w:r>
-      <w:proofErr w:type="gramStart"/>
-      <w:r>
-        <w:t xml:space="preserve">meer  </w:t>
-      </w:r>
-      <w:proofErr w:type="spellStart"/>
-      <w:r>
-        <w:t>ondehoudbaarheid</w:t>
-      </w:r>
-      <w:proofErr w:type="spellEnd"/>
-      <w:proofErr w:type="gramEnd"/>
-      <w:r>
-        <w:t xml:space="preserve"> van de code, maar is ook flexibel voor als je later je later je code wil uitbreiden, Ook kan je (indien nodig) andere bedrijven verschillende functies laten schrijven voor 1 laag, is elke laag apart van elkaar dus kan je makkelijk verandering aan code maken in 1 laag zonder dat je de rest van de code hoeft aan te passen</w:t>
-      </w:r>
-      <w:r>
-        <w:t xml:space="preserve"> en je kan makkelijker testen in je code en je code dus veiliger maken omdat je op meer punten kan testen.</w:t>
+        <w:t xml:space="preserve">Deze architectuur bevordert de </w:t>
+      </w:r>
+      <w:proofErr w:type="spellStart"/>
+      <w:r>
+        <w:t>onderhoudbaarheid</w:t>
+      </w:r>
+      <w:proofErr w:type="spellEnd"/>
+      <w:r>
+        <w:t>, schaalbaarheid en testbaarheid van de applicatie. Doordat elke laag een eigen verantwoordelijkheid heeft (</w:t>
+      </w:r>
+      <w:proofErr w:type="spellStart"/>
+      <w:r>
+        <w:t>separation</w:t>
+      </w:r>
+      <w:proofErr w:type="spellEnd"/>
+      <w:r>
+        <w:t xml:space="preserve"> of concerns), blijft de code overzichtelijk en gestructureerd.</w:t>
+      </w:r>
+    </w:p>
+    <w:p>
+      <w:r>
+        <w:t>Daarnaast biedt deze opzet flexibiliteit bij toekomstige uitbreidingen. Functionaliteiten kunnen per laag worden aangepast of uitgebreid zonder dat dit directe impact heeft op de andere lagen. Hierdoor wordt het eenvoudiger om wijzigingen door te voeren en de applicatie verder te ontwikkelen.</w:t>
+      </w:r>
+    </w:p>
+    <w:p>
+      <w:r>
+        <w:t>Een bijkomend voordeel is dat de lagen onafhankelijk van elkaar kunnen worden ontwikkeld. Dit maakt het mogelijk om taken te verdelen, bijvoorbeeld wanneer meerdere ontwikkelaars of externe partijen aan verschillende onderdelen van het systeem werken.</w:t>
+      </w:r>
+    </w:p>
+    <w:p>
+      <w:r>
+        <w:t xml:space="preserve">Tot slot vergemakkelijkt deze architectuur het testen van de applicatie. Omdat de lagen logisch zijn gescheiden, kunnen ze afzonderlijk worden getest (unit </w:t>
+      </w:r>
+      <w:proofErr w:type="spellStart"/>
+      <w:r>
+        <w:t>testing</w:t>
+      </w:r>
+      <w:proofErr w:type="spellEnd"/>
+      <w:r>
+        <w:t>), wat bijdraagt aan een hogere codekwaliteit en een veiligere, betrouwbaardere applicatie.</w:t>
       </w:r>
     </w:p>
     <w:p/>
@@ -1705,7 +1683,7 @@
       <w:pPr>
         <w:pStyle w:val="Kop1"/>
       </w:pPr>
-      <w:bookmarkStart w:id="2" w:name="_Toc222386884"/>
+      <w:bookmarkStart w:id="2" w:name="_Toc222390853"/>
       <w:r>
         <w:lastRenderedPageBreak/>
         <w:t>Front-end aanpassingen</w:t>
@@ -1719,7 +1697,7 @@
       <w:pPr>
         <w:pStyle w:val="Kop2"/>
       </w:pPr>
-      <w:bookmarkStart w:id="3" w:name="_Toc222386885"/>
+      <w:bookmarkStart w:id="3" w:name="_Toc222390854"/>
       <w:proofErr w:type="spellStart"/>
       <w:r>
         <w:t>Navbar</w:t>
@@ -1734,7 +1712,7 @@
       <w:pPr>
         <w:pStyle w:val="Kop3"/>
       </w:pPr>
-      <w:bookmarkStart w:id="4" w:name="_Toc222386886"/>
+      <w:bookmarkStart w:id="4" w:name="_Toc222390855"/>
       <w:r>
         <w:t>Hoe ziet de navbar er nu uit?</w:t>
       </w:r>
@@ -1799,7 +1777,7 @@
       <w:pPr>
         <w:pStyle w:val="Kop2"/>
       </w:pPr>
-      <w:bookmarkStart w:id="5" w:name="_Toc222386887"/>
+      <w:bookmarkStart w:id="5" w:name="_Toc222390856"/>
       <w:r>
         <w:t>2 informatie tegels verwisselen.</w:t>
       </w:r>
@@ -1809,7 +1787,7 @@
       <w:pPr>
         <w:pStyle w:val="Kop3"/>
       </w:pPr>
-      <w:bookmarkStart w:id="6" w:name="_Toc222386888"/>
+      <w:bookmarkStart w:id="6" w:name="_Toc222390857"/>
       <w:r>
         <w:t>Hoe ziet het er nu uit?</w:t>
       </w:r>
@@ -1870,12 +1848,19 @@
         <w:t>De 2 tegels wil ik verwisselen. Dus de gateway-scan aan de linkerkant en uitleg over de gateway aan de rechterkant.</w:t>
       </w:r>
     </w:p>
+    <w:p/>
+    <w:p/>
+    <w:p/>
+    <w:p/>
+    <w:p/>
+    <w:p/>
     <w:p>
       <w:pPr>
         <w:pStyle w:val="Kop1"/>
       </w:pPr>
-      <w:bookmarkStart w:id="7" w:name="_Toc222386889"/>
-      <w:r>
+      <w:bookmarkStart w:id="7" w:name="_Toc222390858"/>
+      <w:r>
+        <w:lastRenderedPageBreak/>
         <w:t>Smart-</w:t>
       </w:r>
       <w:proofErr w:type="spellStart"/>
@@ -1892,7 +1877,7 @@
       <w:pPr>
         <w:pStyle w:val="Kop3"/>
       </w:pPr>
-      <w:bookmarkStart w:id="8" w:name="_Toc222386890"/>
+      <w:bookmarkStart w:id="8" w:name="_Toc222390859"/>
       <w:r>
         <w:t>Wat is het nu?</w:t>
       </w:r>
@@ -1923,7 +1908,7 @@
       <w:pPr>
         <w:pStyle w:val="Kop3"/>
       </w:pPr>
-      <w:bookmarkStart w:id="9" w:name="_Toc222386891"/>
+      <w:bookmarkStart w:id="9" w:name="_Toc222390860"/>
       <w:r>
         <w:t>Wat wil ik ervan maken?</w:t>
       </w:r>
@@ -1954,16 +1939,388 @@
       <w:pPr>
         <w:pStyle w:val="Kop3"/>
       </w:pPr>
-      <w:bookmarkStart w:id="10" w:name="_Toc222386892"/>
+      <w:bookmarkStart w:id="10" w:name="_Toc222390861"/>
+      <w:r>
+        <w:t>Security</w:t>
+      </w:r>
+      <w:bookmarkEnd w:id="10"/>
+    </w:p>
+    <w:p>
+      <w:r>
+        <w:t xml:space="preserve">Ik wil (indien mogelijk) in de rootfolder (homefolder) van de </w:t>
+      </w:r>
+      <w:proofErr w:type="spellStart"/>
+      <w:r>
+        <w:t>frontend</w:t>
+      </w:r>
+      <w:proofErr w:type="spellEnd"/>
+      <w:r>
+        <w:t xml:space="preserve"> een </w:t>
+      </w:r>
+      <w:proofErr w:type="spellStart"/>
+      <w:r>
+        <w:t>config.env</w:t>
+      </w:r>
+      <w:proofErr w:type="spellEnd"/>
+      <w:r>
+        <w:t xml:space="preserve"> aanmaken waarin ik een gebruikersnaam en wachtwoord zet welke worden meegestuurd met elke </w:t>
+      </w:r>
+      <w:proofErr w:type="spellStart"/>
+      <w:r>
+        <w:t>request</w:t>
+      </w:r>
+      <w:proofErr w:type="spellEnd"/>
+      <w:r>
+        <w:t xml:space="preserve"> naar de API.</w:t>
+      </w:r>
+    </w:p>
+    <w:p>
+      <w:pPr>
+        <w:pStyle w:val="Kop3"/>
+      </w:pPr>
+      <w:proofErr w:type="spellStart"/>
+      <w:r>
+        <w:t>Sequence</w:t>
+      </w:r>
+      <w:proofErr w:type="spellEnd"/>
+      <w:r>
+        <w:t xml:space="preserve"> diagram </w:t>
+      </w:r>
+    </w:p>
+    <w:p>
+      <w:r>
+        <w:rPr>
+          <w:noProof/>
+        </w:rPr>
+        <w:drawing>
+          <wp:inline distT="0" distB="0" distL="0" distR="0" wp14:anchorId="7D170D9F" wp14:editId="20051BDF">
+            <wp:extent cx="5753100" cy="2495550"/>
+            <wp:effectExtent l="0" t="0" r="0" b="0"/>
+            <wp:docPr id="276705987" name="Afbeelding 1"/>
+            <wp:cNvGraphicFramePr>
+              <a:graphicFrameLocks xmlns:a="http://schemas.openxmlformats.org/drawingml/2006/main" noChangeAspect="1"/>
+            </wp:cNvGraphicFramePr>
+            <a:graphic xmlns:a="http://schemas.openxmlformats.org/drawingml/2006/main">
+              <a:graphicData uri="http://schemas.openxmlformats.org/drawingml/2006/picture">
+                <pic:pic xmlns:pic="http://schemas.openxmlformats.org/drawingml/2006/picture">
+                  <pic:nvPicPr>
+                    <pic:cNvPr id="0" name="Picture 1"/>
+                    <pic:cNvPicPr>
+                      <a:picLocks noChangeAspect="1" noChangeArrowheads="1"/>
+                    </pic:cNvPicPr>
+                  </pic:nvPicPr>
+                  <pic:blipFill>
+                    <a:blip r:embed="rId7" cstate="print">
+                      <a:extLst>
+                        <a:ext uri="{28A0092B-C50C-407E-A947-70E740481C1C}">
+                          <a14:useLocalDpi xmlns:a14="http://schemas.microsoft.com/office/drawing/2010/main" val="0"/>
+                        </a:ext>
+                      </a:extLst>
+                    </a:blip>
+                    <a:srcRect/>
+                    <a:stretch>
+                      <a:fillRect/>
+                    </a:stretch>
+                  </pic:blipFill>
+                  <pic:spPr bwMode="auto">
+                    <a:xfrm>
+                      <a:off x="0" y="0"/>
+                      <a:ext cx="5753100" cy="2495550"/>
+                    </a:xfrm>
+                    <a:prstGeom prst="rect">
+                      <a:avLst/>
+                    </a:prstGeom>
+                    <a:noFill/>
+                    <a:ln>
+                      <a:noFill/>
+                    </a:ln>
+                  </pic:spPr>
+                </pic:pic>
+              </a:graphicData>
+            </a:graphic>
+          </wp:inline>
+        </w:drawing>
+      </w:r>
+    </w:p>
+    <w:p/>
+    <w:p/>
+    <w:p/>
+    <w:p/>
+    <w:p/>
+    <w:p>
+      <w:pPr>
+        <w:pStyle w:val="Kop1"/>
+      </w:pPr>
+      <w:bookmarkStart w:id="11" w:name="_Toc222390862"/>
       <w:r>
         <w:lastRenderedPageBreak/>
+        <w:t>Grafiek Smart-</w:t>
+      </w:r>
+      <w:proofErr w:type="spellStart"/>
+      <w:r>
+        <w:t>IoT</w:t>
+      </w:r>
+      <w:proofErr w:type="spellEnd"/>
+      <w:r>
+        <w:t>-Gateway-Scan</w:t>
+      </w:r>
+      <w:bookmarkEnd w:id="11"/>
+    </w:p>
+    <w:p>
+      <w:r>
+        <w:t>De Smart-</w:t>
+      </w:r>
+      <w:proofErr w:type="spellStart"/>
+      <w:r>
+        <w:t>IoT</w:t>
+      </w:r>
+      <w:proofErr w:type="spellEnd"/>
+      <w:r>
+        <w:t xml:space="preserve">-Gateway-Scan wil ik uit een API laten zien, maar ik wil hem ook een grafiek laten zien van deze scan vanuit een API. Deze API stuurt ieder uur een </w:t>
+      </w:r>
+      <w:proofErr w:type="spellStart"/>
+      <w:r>
+        <w:t>request</w:t>
+      </w:r>
+      <w:proofErr w:type="spellEnd"/>
+      <w:r>
+        <w:t xml:space="preserve"> naar de </w:t>
+      </w:r>
+      <w:proofErr w:type="spellStart"/>
+      <w:r>
+        <w:t>back-end</w:t>
+      </w:r>
+      <w:proofErr w:type="spellEnd"/>
+      <w:r>
+        <w:t xml:space="preserve"> en deze krijgt 1 nummer terug en dit zijn het aantal apparaten dat gescand zijn in dat afgelopen uur. </w:t>
+      </w:r>
+    </w:p>
+    <w:p>
+      <w:pPr>
+        <w:pStyle w:val="Kop3"/>
+      </w:pPr>
+      <w:bookmarkStart w:id="12" w:name="_Toc222390863"/>
+      <w:r>
+        <w:t xml:space="preserve">Framework en </w:t>
+      </w:r>
+      <w:proofErr w:type="spellStart"/>
+      <w:r>
+        <w:t>libraries</w:t>
+      </w:r>
+      <w:bookmarkEnd w:id="12"/>
+      <w:proofErr w:type="spellEnd"/>
+    </w:p>
+    <w:p>
+      <w:r>
+        <w:t xml:space="preserve">Ik wil deze grafiek realiseren met python en met de </w:t>
+      </w:r>
+      <w:proofErr w:type="spellStart"/>
+      <w:r>
+        <w:t>library</w:t>
+      </w:r>
+      <w:proofErr w:type="spellEnd"/>
+      <w:r>
+        <w:t xml:space="preserve"> </w:t>
+      </w:r>
+      <w:proofErr w:type="spellStart"/>
+      <w:r>
+        <w:t>Matploblib</w:t>
+      </w:r>
+      <w:proofErr w:type="spellEnd"/>
+      <w:r>
+        <w:t xml:space="preserve">, echter weet ik niet wat er op dit moment wordt gebruikt voor codetaal of eventuele </w:t>
+      </w:r>
+      <w:proofErr w:type="spellStart"/>
+      <w:r>
+        <w:t>frameworks</w:t>
+      </w:r>
+      <w:proofErr w:type="spellEnd"/>
+      <w:r>
+        <w:t xml:space="preserve"> binnen het bedrijf. Als ik dat zeker weet kan ik pas met zekerheid zeggen welke </w:t>
+      </w:r>
+      <w:proofErr w:type="spellStart"/>
+      <w:r>
+        <w:t>library</w:t>
+      </w:r>
+      <w:proofErr w:type="spellEnd"/>
+      <w:r>
+        <w:t xml:space="preserve"> ik hiervoor kan gebruiken.</w:t>
+      </w:r>
+    </w:p>
+    <w:p>
+      <w:pPr>
+        <w:pStyle w:val="Kop3"/>
+      </w:pPr>
+      <w:bookmarkStart w:id="13" w:name="_Toc222390864"/>
+      <w:r>
         <w:t>Security</w:t>
       </w:r>
-      <w:bookmarkEnd w:id="10"/>
-    </w:p>
-    <w:p>
-      <w:r>
-        <w:t xml:space="preserve">Ik wil (indien mogelijk) in de rootfolder (homefolder) van de </w:t>
+      <w:bookmarkEnd w:id="13"/>
+    </w:p>
+    <w:p>
+      <w:r>
+        <w:t xml:space="preserve">Net zoals in de vorige vraagstelling wil ik in de rootfolder (homefolder) een </w:t>
+      </w:r>
+      <w:proofErr w:type="spellStart"/>
+      <w:r>
+        <w:t>config.env</w:t>
+      </w:r>
+      <w:proofErr w:type="spellEnd"/>
+      <w:r>
+        <w:t xml:space="preserve"> fil e maken waarin een gebruikersnaam en wachtwoord staan die mee wordt gestuurd in de get </w:t>
+      </w:r>
+      <w:proofErr w:type="spellStart"/>
+      <w:r>
+        <w:t>request</w:t>
+      </w:r>
+      <w:proofErr w:type="spellEnd"/>
+      <w:r>
+        <w:t xml:space="preserve"> naar de backend.</w:t>
+      </w:r>
+    </w:p>
+    <w:p/>
+    <w:p/>
+    <w:p/>
+    <w:p/>
+    <w:p/>
+    <w:p/>
+    <w:p/>
+    <w:p/>
+    <w:p/>
+    <w:p/>
+    <w:p/>
+    <w:p/>
+    <w:p/>
+    <w:p>
+      <w:pPr>
+        <w:pStyle w:val="Kop1"/>
+      </w:pPr>
+      <w:bookmarkStart w:id="14" w:name="_Toc222390865"/>
+      <w:proofErr w:type="spellStart"/>
+      <w:r>
+        <w:lastRenderedPageBreak/>
+        <w:t>Back-end</w:t>
+      </w:r>
+      <w:proofErr w:type="spellEnd"/>
+      <w:r>
+        <w:t xml:space="preserve"> aanpassingen/ toevoegingen</w:t>
+      </w:r>
+      <w:bookmarkEnd w:id="14"/>
+    </w:p>
+    <w:p>
+      <w:pPr>
+        <w:pStyle w:val="Kop3"/>
+      </w:pPr>
+      <w:bookmarkStart w:id="15" w:name="_Toc222390866"/>
+      <w:r>
+        <w:t>Smart-</w:t>
+      </w:r>
+      <w:proofErr w:type="spellStart"/>
+      <w:r>
+        <w:t>IoT</w:t>
+      </w:r>
+      <w:proofErr w:type="spellEnd"/>
+      <w:r>
+        <w:t>-Gateway-Scan halen uit een API</w:t>
+      </w:r>
+      <w:bookmarkEnd w:id="15"/>
+    </w:p>
+    <w:p>
+      <w:r>
+        <w:t>Zoals eerder vernoemd wil ik de Smart-</w:t>
+      </w:r>
+      <w:proofErr w:type="spellStart"/>
+      <w:r>
+        <w:t>IoT</w:t>
+      </w:r>
+      <w:proofErr w:type="spellEnd"/>
+      <w:r>
+        <w:t xml:space="preserve">-Gateway-Scan uit een API gaan halen, zodat deze via een sectie op de website gezien kan laten worden op de homepage van de website I.P.V een livestream vanuit </w:t>
+      </w:r>
+      <w:proofErr w:type="spellStart"/>
+      <w:r>
+        <w:t>Twitch</w:t>
+      </w:r>
+      <w:proofErr w:type="spellEnd"/>
+      <w:r>
+        <w:t>.</w:t>
+      </w:r>
+      <w:r>
+        <w:br/>
+      </w:r>
+    </w:p>
+    <w:p>
+      <w:pPr>
+        <w:pStyle w:val="Kop4"/>
+      </w:pPr>
+      <w:r>
+        <w:t>Framework</w:t>
+      </w:r>
+    </w:p>
+    <w:p>
+      <w:r>
+        <w:t xml:space="preserve">De </w:t>
+      </w:r>
+      <w:proofErr w:type="spellStart"/>
+      <w:r>
+        <w:t>API’s</w:t>
+      </w:r>
+      <w:proofErr w:type="spellEnd"/>
+      <w:r>
+        <w:t xml:space="preserve"> die ik ga ontwikkelen binnen mijn stageperiode ga ik maken met Python in het ‘Django’ </w:t>
+      </w:r>
+      <w:proofErr w:type="spellStart"/>
+      <w:r>
+        <w:t>framework</w:t>
+      </w:r>
+      <w:proofErr w:type="spellEnd"/>
+      <w:r>
+        <w:t>.</w:t>
+      </w:r>
+    </w:p>
+    <w:p>
+      <w:pPr>
+        <w:pStyle w:val="Kop3"/>
+      </w:pPr>
+      <w:bookmarkStart w:id="16" w:name="_Toc222390867"/>
+      <w:r>
+        <w:t>Security</w:t>
+      </w:r>
+      <w:bookmarkEnd w:id="16"/>
+    </w:p>
+    <w:p>
+      <w:r>
+        <w:t xml:space="preserve">Natuurlijk moeten er </w:t>
+      </w:r>
+      <w:r>
+        <w:t>securitymaatregelen</w:t>
+      </w:r>
+      <w:r>
+        <w:t xml:space="preserve"> zitten bij een API die op een live pagina wordt gebruikt. Om dit zo veilig mogelijk te maken wil ik in de rootfolder (homefolder) voor de </w:t>
+      </w:r>
+      <w:proofErr w:type="spellStart"/>
+      <w:r>
+        <w:t>API’s</w:t>
+      </w:r>
+      <w:proofErr w:type="spellEnd"/>
+      <w:r>
+        <w:t xml:space="preserve"> een </w:t>
+      </w:r>
+      <w:proofErr w:type="spellStart"/>
+      <w:r>
+        <w:t>config.env</w:t>
+      </w:r>
+      <w:proofErr w:type="spellEnd"/>
+      <w:r>
+        <w:t xml:space="preserve"> plaatsen. Hierin wil ik natuurlijk een gebruikersnaam en een wachtwoord plaatsen voor de database, maar ook een gebruikersnaam en wachtwoord die ik verwacht in een </w:t>
+      </w:r>
+      <w:proofErr w:type="spellStart"/>
+      <w:r>
+        <w:t>request</w:t>
+      </w:r>
+      <w:proofErr w:type="spellEnd"/>
+      <w:r>
+        <w:t xml:space="preserve"> header vanuit de </w:t>
       </w:r>
       <w:proofErr w:type="spellStart"/>
       <w:r>
@@ -1971,7 +2328,82 @@
       </w:r>
       <w:proofErr w:type="spellEnd"/>
       <w:r>
-        <w:t xml:space="preserve"> een </w:t>
+        <w:t xml:space="preserve">. Als deze niet aanwezig zijn dan stuurt de API niks terug naar de client. </w:t>
+      </w:r>
+    </w:p>
+    <w:p/>
+    <w:p/>
+    <w:p/>
+    <w:p/>
+    <w:p/>
+    <w:p/>
+    <w:p/>
+    <w:p/>
+    <w:p/>
+    <w:p/>
+    <w:p/>
+    <w:p/>
+    <w:p/>
+    <w:p>
+      <w:pPr>
+        <w:pStyle w:val="Kop2"/>
+      </w:pPr>
+      <w:bookmarkStart w:id="17" w:name="_Toc222390868"/>
+      <w:r>
+        <w:lastRenderedPageBreak/>
+        <w:t>Grafiek maken van Smart-</w:t>
+      </w:r>
+      <w:proofErr w:type="spellStart"/>
+      <w:r>
+        <w:t>IoT</w:t>
+      </w:r>
+      <w:proofErr w:type="spellEnd"/>
+      <w:r>
+        <w:t>-Gateway-Scan</w:t>
+      </w:r>
+      <w:bookmarkEnd w:id="17"/>
+    </w:p>
+    <w:p>
+      <w:r>
+        <w:t xml:space="preserve">Een ander vraag vanuit mijn stage is of ik een tabel kon maken voor op de homepagina waarin ik per uur laat zien hoeveel </w:t>
+      </w:r>
+      <w:r>
+        <w:t>BLE-apparaten</w:t>
+      </w:r>
+      <w:r>
+        <w:t xml:space="preserve"> er zijn gescand in dat uur. Hierdoor kan je een heel mooi overzicht</w:t>
+      </w:r>
+      <w:r>
+        <w:t xml:space="preserve"> krijgt met hoeveel BLE-apparaten er in een dag in de buurt van het kantoor loopt.</w:t>
+      </w:r>
+    </w:p>
+    <w:p>
+      <w:pPr>
+        <w:pStyle w:val="Kop4"/>
+      </w:pPr>
+      <w:r>
+        <w:t>Security</w:t>
+      </w:r>
+    </w:p>
+    <w:p>
+      <w:r>
+        <w:t xml:space="preserve">Ook dit wil ik op </w:t>
+      </w:r>
+      <w:proofErr w:type="gramStart"/>
+      <w:r>
+        <w:t>een zelfde</w:t>
+      </w:r>
+      <w:proofErr w:type="gramEnd"/>
+      <w:r>
+        <w:t xml:space="preserve"> manier aanpakken als de bovenstaande vraag </w:t>
+      </w:r>
+      <w:proofErr w:type="spellStart"/>
+      <w:r>
+        <w:t>kwa</w:t>
+      </w:r>
+      <w:proofErr w:type="spellEnd"/>
+      <w:r>
+        <w:t xml:space="preserve"> security. Ook hier wil ik in een </w:t>
       </w:r>
       <w:proofErr w:type="spellStart"/>
       <w:r>
@@ -1979,381 +2411,52 @@
       </w:r>
       <w:proofErr w:type="spellEnd"/>
       <w:r>
-        <w:t xml:space="preserve"> aanmaken waarin ik een gebruikersnaam en wachtwoord zet welke worden meegestuurd met elke </w:t>
-      </w:r>
-      <w:proofErr w:type="spellStart"/>
-      <w:r>
-        <w:t>request</w:t>
-      </w:r>
-      <w:proofErr w:type="spellEnd"/>
-      <w:r>
-        <w:t xml:space="preserve"> naar de API.</w:t>
-      </w:r>
-    </w:p>
-    <w:p/>
-    <w:p/>
-    <w:p/>
-    <w:p>
-      <w:pPr>
-        <w:pStyle w:val="Kop1"/>
-      </w:pPr>
-      <w:bookmarkStart w:id="11" w:name="_Toc222386893"/>
-      <w:r>
-        <w:t>Grafiek Smart-</w:t>
-      </w:r>
-      <w:proofErr w:type="spellStart"/>
-      <w:r>
-        <w:t>IoT</w:t>
-      </w:r>
-      <w:proofErr w:type="spellEnd"/>
-      <w:r>
-        <w:t>-Gateway-Scan</w:t>
-      </w:r>
-      <w:bookmarkEnd w:id="11"/>
-    </w:p>
-    <w:p>
-      <w:r>
-        <w:t>De Smart-</w:t>
-      </w:r>
-      <w:proofErr w:type="spellStart"/>
-      <w:r>
-        <w:t>IoT</w:t>
-      </w:r>
-      <w:proofErr w:type="spellEnd"/>
-      <w:r>
-        <w:t xml:space="preserve">-Gateway-Scan wil ik uit een API laten zien, maar ik wil hem ook een grafiek laten zien van deze scan vanuit een API. Deze API stuurt ieder uur een </w:t>
-      </w:r>
-      <w:proofErr w:type="spellStart"/>
-      <w:r>
-        <w:t>request</w:t>
-      </w:r>
-      <w:proofErr w:type="spellEnd"/>
-      <w:r>
-        <w:t xml:space="preserve"> naar de </w:t>
-      </w:r>
-      <w:proofErr w:type="spellStart"/>
-      <w:r>
-        <w:t>back-end</w:t>
-      </w:r>
-      <w:proofErr w:type="spellEnd"/>
-      <w:r>
-        <w:t xml:space="preserve"> en deze krijgt 1 nummer terug en dit zijn het aantal apparaten dat gescand zijn in dat afgelopen uur. </w:t>
-      </w:r>
-    </w:p>
-    <w:p>
-      <w:pPr>
-        <w:pStyle w:val="Kop3"/>
-      </w:pPr>
-      <w:bookmarkStart w:id="12" w:name="_Toc222386894"/>
-      <w:r>
-        <w:t xml:space="preserve">Framework en </w:t>
-      </w:r>
-      <w:proofErr w:type="spellStart"/>
-      <w:r>
-        <w:t>libraries</w:t>
-      </w:r>
-      <w:bookmarkEnd w:id="12"/>
-      <w:proofErr w:type="spellEnd"/>
-    </w:p>
-    <w:p>
-      <w:r>
-        <w:t xml:space="preserve">Ik wil deze grafiek realiseren met python en met de </w:t>
-      </w:r>
-      <w:proofErr w:type="spellStart"/>
-      <w:r>
-        <w:t>library</w:t>
-      </w:r>
-      <w:proofErr w:type="spellEnd"/>
-      <w:r>
-        <w:t xml:space="preserve"> </w:t>
-      </w:r>
-      <w:proofErr w:type="spellStart"/>
-      <w:r>
-        <w:t>Matploblib</w:t>
-      </w:r>
-      <w:proofErr w:type="spellEnd"/>
-      <w:r>
-        <w:t xml:space="preserve">, echter weet ik niet wat er op dit moment wordt gebruikt voor codetaal of eventuele </w:t>
-      </w:r>
-      <w:proofErr w:type="spellStart"/>
-      <w:r>
-        <w:t>frameworks</w:t>
-      </w:r>
-      <w:proofErr w:type="spellEnd"/>
-      <w:r>
-        <w:t xml:space="preserve"> binnen het bedrijf. Als ik dat zeker weet kan ik pas met zekerheid zeggen welke </w:t>
-      </w:r>
-      <w:proofErr w:type="spellStart"/>
-      <w:r>
-        <w:t>library</w:t>
-      </w:r>
-      <w:proofErr w:type="spellEnd"/>
-      <w:r>
-        <w:t xml:space="preserve"> ik hiervoor kan gebruiken.</w:t>
-      </w:r>
-    </w:p>
-    <w:p>
-      <w:pPr>
-        <w:pStyle w:val="Kop3"/>
-      </w:pPr>
-      <w:bookmarkStart w:id="13" w:name="_Toc222386895"/>
-      <w:r>
-        <w:t>Security</w:t>
-      </w:r>
-      <w:bookmarkEnd w:id="13"/>
-    </w:p>
-    <w:p>
-      <w:r>
-        <w:t xml:space="preserve">Net zoals in de vorige vraagstelling wil ik in de rootfolder (homefolder) een </w:t>
-      </w:r>
-      <w:proofErr w:type="spellStart"/>
-      <w:r>
-        <w:t>config.env</w:t>
-      </w:r>
-      <w:proofErr w:type="spellEnd"/>
-      <w:r>
-        <w:t xml:space="preserve"> fil e maken waarin een gebruikersnaam en wachtwoord staan die mee wordt gestuurd in de get </w:t>
-      </w:r>
-      <w:proofErr w:type="spellStart"/>
-      <w:r>
-        <w:t>request</w:t>
-      </w:r>
-      <w:proofErr w:type="spellEnd"/>
-      <w:r>
-        <w:t xml:space="preserve"> naar de backend. </w:t>
-      </w:r>
-    </w:p>
-    <w:p>
-      <w:pPr>
-        <w:pStyle w:val="Kop1"/>
-      </w:pPr>
-      <w:bookmarkStart w:id="14" w:name="_Toc222386896"/>
-      <w:proofErr w:type="spellStart"/>
-      <w:r>
-        <w:t>Back-end</w:t>
-      </w:r>
-      <w:proofErr w:type="spellEnd"/>
-      <w:r>
-        <w:t xml:space="preserve"> aanpassingen/ toevoegingen</w:t>
-      </w:r>
-      <w:bookmarkEnd w:id="14"/>
-    </w:p>
-    <w:p>
-      <w:pPr>
-        <w:pStyle w:val="Kop3"/>
-      </w:pPr>
-      <w:bookmarkStart w:id="15" w:name="_Toc222386897"/>
-      <w:r>
-        <w:t>Smart-</w:t>
-      </w:r>
-      <w:proofErr w:type="spellStart"/>
-      <w:r>
-        <w:t>IoT</w:t>
-      </w:r>
-      <w:proofErr w:type="spellEnd"/>
-      <w:r>
-        <w:t>-Gateway-Scan halen uit een API</w:t>
-      </w:r>
-      <w:bookmarkEnd w:id="15"/>
-    </w:p>
-    <w:p>
-      <w:r>
-        <w:t>Zoals eerder vernoemd wil ik de Smart-</w:t>
-      </w:r>
-      <w:proofErr w:type="spellStart"/>
-      <w:r>
-        <w:t>IoT</w:t>
-      </w:r>
-      <w:proofErr w:type="spellEnd"/>
-      <w:r>
-        <w:t xml:space="preserve">-Gateway-Scan uit een API gaan halen, zodat deze via een sectie op de website gezien kan laten worden op de homepage van de website I.P.V een livestream vanuit </w:t>
-      </w:r>
-      <w:proofErr w:type="spellStart"/>
-      <w:r>
-        <w:t>Twitch</w:t>
-      </w:r>
-      <w:proofErr w:type="spellEnd"/>
+        <w:t xml:space="preserve"> bestand zetten </w:t>
+      </w:r>
+      <w:proofErr w:type="spellStart"/>
+      <w:r>
+        <w:t>wellke</w:t>
+      </w:r>
+      <w:proofErr w:type="spellEnd"/>
+      <w:r>
+        <w:t xml:space="preserve"> gebruikersnaam en welk wachtwoord er moeten worden opgevraagd in </w:t>
+      </w:r>
+      <w:proofErr w:type="gramStart"/>
+      <w:r>
+        <w:t>de front-end</w:t>
+      </w:r>
+      <w:proofErr w:type="gramEnd"/>
       <w:r>
         <w:t>.</w:t>
       </w:r>
-      <w:r>
-        <w:br/>
-      </w:r>
-    </w:p>
-    <w:p>
-      <w:pPr>
-        <w:pStyle w:val="Kop4"/>
-      </w:pPr>
-      <w:r>
-        <w:t>Framework</w:t>
-      </w:r>
-    </w:p>
-    <w:p>
-      <w:r>
-        <w:t xml:space="preserve">De </w:t>
-      </w:r>
-      <w:proofErr w:type="spellStart"/>
-      <w:r>
-        <w:t>API’s</w:t>
-      </w:r>
-      <w:proofErr w:type="spellEnd"/>
-      <w:r>
-        <w:t xml:space="preserve"> die ik ga ontwikkelen binnen mijn stageperiode ga ik maken met Python in het ‘Django’ </w:t>
-      </w:r>
-      <w:proofErr w:type="spellStart"/>
-      <w:r>
-        <w:t>framework</w:t>
-      </w:r>
-      <w:proofErr w:type="spellEnd"/>
-      <w:r>
-        <w:t>.</w:t>
-      </w:r>
-    </w:p>
-    <w:p>
-      <w:pPr>
-        <w:pStyle w:val="Kop3"/>
-      </w:pPr>
-      <w:bookmarkStart w:id="16" w:name="_Toc222386898"/>
+    </w:p>
+    <w:p/>
+    <w:p/>
+    <w:p/>
+    <w:p/>
+    <w:p/>
+    <w:p/>
+    <w:p/>
+    <w:p/>
+    <w:p/>
+    <w:p/>
+    <w:p/>
+    <w:p/>
+    <w:p/>
+    <w:p/>
+    <w:p/>
+    <w:p/>
+    <w:p/>
+    <w:p/>
+    <w:p/>
+    <w:p/>
+    <w:p>
+      <w:pPr>
+        <w:pStyle w:val="Kop2"/>
+      </w:pPr>
+      <w:bookmarkStart w:id="18" w:name="_Toc222390869"/>
       <w:r>
         <w:lastRenderedPageBreak/>
-        <w:t>Security</w:t>
-      </w:r>
-      <w:bookmarkEnd w:id="16"/>
-    </w:p>
-    <w:p>
-      <w:r>
-        <w:t xml:space="preserve">Natuurlijk moeten er </w:t>
-      </w:r>
-      <w:r>
-        <w:t>securitymaatregelen</w:t>
-      </w:r>
-      <w:r>
-        <w:t xml:space="preserve"> zitten bij een API die op een live pagina wordt gebruikt. Om dit zo veilig mogelijk te maken wil ik in de rootfolder (homefolder) voor de </w:t>
-      </w:r>
-      <w:proofErr w:type="spellStart"/>
-      <w:r>
-        <w:t>API’s</w:t>
-      </w:r>
-      <w:proofErr w:type="spellEnd"/>
-      <w:r>
-        <w:t xml:space="preserve"> een </w:t>
-      </w:r>
-      <w:proofErr w:type="spellStart"/>
-      <w:r>
-        <w:t>config.env</w:t>
-      </w:r>
-      <w:proofErr w:type="spellEnd"/>
-      <w:r>
-        <w:t xml:space="preserve"> plaatsen. Hierin wil ik natuurlijk een gebruikersnaam en een wachtwoord plaatsen voor de database, maar ook een gebruikersnaam en wachtwoord die ik verwacht in een </w:t>
-      </w:r>
-      <w:proofErr w:type="spellStart"/>
-      <w:r>
-        <w:t>request</w:t>
-      </w:r>
-      <w:proofErr w:type="spellEnd"/>
-      <w:r>
-        <w:t xml:space="preserve"> header vanuit de </w:t>
-      </w:r>
-      <w:proofErr w:type="spellStart"/>
-      <w:r>
-        <w:t>frontend</w:t>
-      </w:r>
-      <w:proofErr w:type="spellEnd"/>
-      <w:r>
-        <w:t xml:space="preserve">. Als deze niet aanwezig zijn dan stuurt de API niks terug naar de client. </w:t>
-      </w:r>
-    </w:p>
-    <w:p>
-      <w:pPr>
-        <w:pStyle w:val="Kop2"/>
-      </w:pPr>
-      <w:bookmarkStart w:id="17" w:name="_Toc222386899"/>
-      <w:r>
-        <w:t>Grafiek maken van Smart-</w:t>
-      </w:r>
-      <w:proofErr w:type="spellStart"/>
-      <w:r>
-        <w:t>IoT</w:t>
-      </w:r>
-      <w:proofErr w:type="spellEnd"/>
-      <w:r>
-        <w:t>-Gateway-Scan</w:t>
-      </w:r>
-      <w:bookmarkEnd w:id="17"/>
-    </w:p>
-    <w:p>
-      <w:r>
-        <w:t xml:space="preserve">Een ander vraag vanuit mijn stage is of ik een tabel kon maken voor op de homepagina waarin ik per uur laat zien hoeveel </w:t>
-      </w:r>
-      <w:r>
-        <w:t>BLE-apparaten</w:t>
-      </w:r>
-      <w:r>
-        <w:t xml:space="preserve"> er zijn gescand in dat uur. Hierdoor kan je een heel mooi overzicht</w:t>
-      </w:r>
-      <w:r>
-        <w:t xml:space="preserve"> krijgt met hoeveel BLE-apparaten er in een dag in de buurt van het kantoor loopt.</w:t>
-      </w:r>
-    </w:p>
-    <w:p>
-      <w:pPr>
-        <w:pStyle w:val="Kop4"/>
-      </w:pPr>
-      <w:r>
-        <w:t>Security</w:t>
-      </w:r>
-    </w:p>
-    <w:p>
-      <w:r>
-        <w:t xml:space="preserve">Ook dit wil ik op </w:t>
-      </w:r>
-      <w:proofErr w:type="gramStart"/>
-      <w:r>
-        <w:t>een zelfde</w:t>
-      </w:r>
-      <w:proofErr w:type="gramEnd"/>
-      <w:r>
-        <w:t xml:space="preserve"> manier aanpakken als de bovenstaande vraag </w:t>
-      </w:r>
-      <w:proofErr w:type="spellStart"/>
-      <w:r>
-        <w:t>kwa</w:t>
-      </w:r>
-      <w:proofErr w:type="spellEnd"/>
-      <w:r>
-        <w:t xml:space="preserve"> security. Ook hier wil ik in een </w:t>
-      </w:r>
-      <w:proofErr w:type="spellStart"/>
-      <w:r>
-        <w:t>config.env</w:t>
-      </w:r>
-      <w:proofErr w:type="spellEnd"/>
-      <w:r>
-        <w:t xml:space="preserve"> bestand zetten </w:t>
-      </w:r>
-      <w:proofErr w:type="spellStart"/>
-      <w:r>
-        <w:t>wellke</w:t>
-      </w:r>
-      <w:proofErr w:type="spellEnd"/>
-      <w:r>
-        <w:t xml:space="preserve"> gebruikersnaam en welk wachtwoord er moeten worden opgevraagd in </w:t>
-      </w:r>
-      <w:proofErr w:type="gramStart"/>
-      <w:r>
-        <w:t>de front-end</w:t>
-      </w:r>
-      <w:proofErr w:type="gramEnd"/>
-      <w:r>
-        <w:t>.</w:t>
-      </w:r>
-    </w:p>
-    <w:p>
-      <w:pPr>
-        <w:pStyle w:val="Kop3"/>
-      </w:pPr>
-      <w:bookmarkStart w:id="18" w:name="_Toc222386900"/>
-      <w:r>
         <w:t>Overig</w:t>
       </w:r>
       <w:bookmarkEnd w:id="18"/>
@@ -2385,6 +2488,155 @@
 <file path=word/numbering.xml><?xml version="1.0" encoding="utf-8"?>
 <w:numbering xmlns:wpc="http://schemas.microsoft.com/office/word/2010/wordprocessingCanvas" xmlns:cx="http://schemas.microsoft.com/office/drawing/2014/chartex" xmlns:cx1="http://schemas.microsoft.com/office/drawing/2015/9/8/chartex" xmlns:cx2="http://schemas.microsoft.com/office/drawing/2015/10/21/chartex" xmlns:cx3="http://schemas.microsoft.com/office/drawing/2016/5/9/chartex" xmlns:cx4="http://schemas.microsoft.com/office/drawing/2016/5/10/chartex" xmlns:cx5="http://schemas.microsoft.com/office/drawing/2016/5/11/chartex" xmlns:cx6="http://schemas.microsoft.com/office/drawing/2016/5/12/chartex" xmlns:cx7="http://schemas.microsoft.com/office/drawing/2016/5/13/chartex" xmlns:cx8="http://schemas.microsoft.com/office/drawing/2016/5/14/chartex" xmlns:mc="http://schemas.openxmlformats.org/markup-compatibility/2006" xmlns:aink="http://schemas.microsoft.com/office/drawing/2016/ink" xmlns:am3d="http://schemas.microsoft.com/office/drawing/2017/model3d" xmlns:o="urn:schemas-microsoft-com:office:office" xmlns:oel="http://schemas.microsoft.com/office/2019/extlst" xmlns:r="http://schemas.openxmlformats.org/officeDocument/2006/relationships" xmlns:m="http://schemas.openxmlformats.org/officeDocument/2006/math" xmlns:v="urn:schemas-microsoft-com:vml" xmlns:wp14="http://schemas.microsoft.com/office/word/2010/wordprocessingDrawing" xmlns:wp="http://schemas.openxmlformats.org/drawingml/2006/wordprocessingDrawing" xmlns:w10="urn:schemas-microsoft-com:office:word" xmlns:w="http://schemas.openxmlformats.org/wordprocessingml/2006/main" xmlns:w14="http://schemas.microsoft.com/office/word/2010/wordml" xmlns:w15="http://schemas.microsoft.com/office/word/2012/wordml" xmlns:w16cex="http://schemas.microsoft.com/office/word/2018/wordml/cex" xmlns:w16cid="http://schemas.microsoft.com/office/word/2016/wordml/cid" xmlns:w16="http://schemas.microsoft.com/office/word/2018/wordml" xmlns:w16du="http://schemas.microsoft.com/office/word/2023/wordml/word16du" xmlns:w16sdtdh="http://schemas.microsoft.com/office/word/2020/wordml/sdtdatahash" xmlns:w16sdtfl="http://schemas.microsoft.com/office/word/2024/wordml/sdtformatlock" xmlns:w16se="http://schemas.microsoft.com/office/word/2015/wordml/symex" xmlns:wpg="http://schemas.microsoft.com/office/word/2010/wordprocessingGroup" xmlns:wpi="http://schemas.microsoft.com/office/word/2010/wordprocessingInk" xmlns:wne="http://schemas.microsoft.com/office/word/2006/wordml" xmlns:wps="http://schemas.microsoft.com/office/word/2010/wordprocessingShape" mc:Ignorable="w14 w15 w16se w16cid w16 w16cex w16sdtdh w16sdtfl w16du wp14">
   <w:abstractNum w:abstractNumId="0" w15:restartNumberingAfterBreak="0">
+    <w:nsid w:val="6E2B493C"/>
+    <w:multiLevelType w:val="multilevel"/>
+    <w:tmpl w:val="A7141F20"/>
+    <w:lvl w:ilvl="0">
+      <w:start w:val="1"/>
+      <w:numFmt w:val="bullet"/>
+      <w:lvlText w:val=""/>
+      <w:lvlJc w:val="left"/>
+      <w:pPr>
+        <w:tabs>
+          <w:tab w:val="num" w:pos="720"/>
+        </w:tabs>
+        <w:ind w:left="720" w:hanging="360"/>
+      </w:pPr>
+      <w:rPr>
+        <w:rFonts w:ascii="Symbol" w:hAnsi="Symbol" w:hint="default"/>
+        <w:sz w:val="20"/>
+      </w:rPr>
+    </w:lvl>
+    <w:lvl w:ilvl="1" w:tentative="1">
+      <w:start w:val="1"/>
+      <w:numFmt w:val="bullet"/>
+      <w:lvlText w:val="o"/>
+      <w:lvlJc w:val="left"/>
+      <w:pPr>
+        <w:tabs>
+          <w:tab w:val="num" w:pos="1440"/>
+        </w:tabs>
+        <w:ind w:left="1440" w:hanging="360"/>
+      </w:pPr>
+      <w:rPr>
+        <w:rFonts w:ascii="Courier New" w:hAnsi="Courier New" w:hint="default"/>
+        <w:sz w:val="20"/>
+      </w:rPr>
+    </w:lvl>
+    <w:lvl w:ilvl="2" w:tentative="1">
+      <w:start w:val="1"/>
+      <w:numFmt w:val="bullet"/>
+      <w:lvlText w:val=""/>
+      <w:lvlJc w:val="left"/>
+      <w:pPr>
+        <w:tabs>
+          <w:tab w:val="num" w:pos="2160"/>
+        </w:tabs>
+        <w:ind w:left="2160" w:hanging="360"/>
+      </w:pPr>
+      <w:rPr>
+        <w:rFonts w:ascii="Wingdings" w:hAnsi="Wingdings" w:hint="default"/>
+        <w:sz w:val="20"/>
+      </w:rPr>
+    </w:lvl>
+    <w:lvl w:ilvl="3" w:tentative="1">
+      <w:start w:val="1"/>
+      <w:numFmt w:val="bullet"/>
+      <w:lvlText w:val=""/>
+      <w:lvlJc w:val="left"/>
+      <w:pPr>
+        <w:tabs>
+          <w:tab w:val="num" w:pos="2880"/>
+        </w:tabs>
+        <w:ind w:left="2880" w:hanging="360"/>
+      </w:pPr>
+      <w:rPr>
+        <w:rFonts w:ascii="Wingdings" w:hAnsi="Wingdings" w:hint="default"/>
+        <w:sz w:val="20"/>
+      </w:rPr>
+    </w:lvl>
+    <w:lvl w:ilvl="4" w:tentative="1">
+      <w:start w:val="1"/>
+      <w:numFmt w:val="bullet"/>
+      <w:lvlText w:val=""/>
+      <w:lvlJc w:val="left"/>
+      <w:pPr>
+        <w:tabs>
+          <w:tab w:val="num" w:pos="3600"/>
+        </w:tabs>
+        <w:ind w:left="3600" w:hanging="360"/>
+      </w:pPr>
+      <w:rPr>
+        <w:rFonts w:ascii="Wingdings" w:hAnsi="Wingdings" w:hint="default"/>
+        <w:sz w:val="20"/>
+      </w:rPr>
+    </w:lvl>
+    <w:lvl w:ilvl="5" w:tentative="1">
+      <w:start w:val="1"/>
+      <w:numFmt w:val="bullet"/>
+      <w:lvlText w:val=""/>
+      <w:lvlJc w:val="left"/>
+      <w:pPr>
+        <w:tabs>
+          <w:tab w:val="num" w:pos="4320"/>
+        </w:tabs>
+        <w:ind w:left="4320" w:hanging="360"/>
+      </w:pPr>
+      <w:rPr>
+        <w:rFonts w:ascii="Wingdings" w:hAnsi="Wingdings" w:hint="default"/>
+        <w:sz w:val="20"/>
+      </w:rPr>
+    </w:lvl>
+    <w:lvl w:ilvl="6" w:tentative="1">
+      <w:start w:val="1"/>
+      <w:numFmt w:val="bullet"/>
+      <w:lvlText w:val=""/>
+      <w:lvlJc w:val="left"/>
+      <w:pPr>
+        <w:tabs>
+          <w:tab w:val="num" w:pos="5040"/>
+        </w:tabs>
+        <w:ind w:left="5040" w:hanging="360"/>
+      </w:pPr>
+      <w:rPr>
+        <w:rFonts w:ascii="Wingdings" w:hAnsi="Wingdings" w:hint="default"/>
+        <w:sz w:val="20"/>
+      </w:rPr>
+    </w:lvl>
+    <w:lvl w:ilvl="7" w:tentative="1">
+      <w:start w:val="1"/>
+      <w:numFmt w:val="bullet"/>
+      <w:lvlText w:val=""/>
+      <w:lvlJc w:val="left"/>
+      <w:pPr>
+        <w:tabs>
+          <w:tab w:val="num" w:pos="5760"/>
+        </w:tabs>
+        <w:ind w:left="5760" w:hanging="360"/>
+      </w:pPr>
+      <w:rPr>
+        <w:rFonts w:ascii="Wingdings" w:hAnsi="Wingdings" w:hint="default"/>
+        <w:sz w:val="20"/>
+      </w:rPr>
+    </w:lvl>
+    <w:lvl w:ilvl="8" w:tentative="1">
+      <w:start w:val="1"/>
+      <w:numFmt w:val="bullet"/>
+      <w:lvlText w:val=""/>
+      <w:lvlJc w:val="left"/>
+      <w:pPr>
+        <w:tabs>
+          <w:tab w:val="num" w:pos="6480"/>
+        </w:tabs>
+        <w:ind w:left="6480" w:hanging="360"/>
+      </w:pPr>
+      <w:rPr>
+        <w:rFonts w:ascii="Wingdings" w:hAnsi="Wingdings" w:hint="default"/>
+        <w:sz w:val="20"/>
+      </w:rPr>
+    </w:lvl>
+  </w:abstractNum>
+  <w:abstractNum w:abstractNumId="1" w15:restartNumberingAfterBreak="0">
     <w:nsid w:val="7EEE35E5"/>
     <w:multiLevelType w:val="hybridMultilevel"/>
     <w:tmpl w:val="BB2C1E06"/>
@@ -2498,6 +2750,9 @@
     </w:lvl>
   </w:abstractNum>
   <w:num w:numId="1" w16cid:durableId="242882420">
+    <w:abstractNumId w:val="1"/>
+  </w:num>
+  <w:num w:numId="2" w16cid:durableId="1152720795">
     <w:abstractNumId w:val="0"/>
   </w:num>
 </w:numbering>
@@ -3102,7 +3357,6 @@
   <w:style w:type="character" w:default="1" w:styleId="Standaardalinea-lettertype">
     <w:name w:val="Default Paragraph Font"/>
     <w:uiPriority w:val="1"/>
-    <w:semiHidden/>
     <w:unhideWhenUsed/>
   </w:style>
   <w:style w:type="table" w:default="1" w:styleId="Standaardtabel">

</xml_diff>

<commit_message>
overige probleem mbt security gedocumenteerd
</commit_message>
<xml_diff>
--- a/start_documents/Werkhandleiding stage.docx
+++ b/start_documents/Werkhandleiding stage.docx
@@ -42,6 +42,7 @@
         <w:rPr>
           <w:b/>
           <w:bCs/>
+          <w:noProof/>
         </w:rPr>
         <w:drawing>
           <wp:anchor distT="0" distB="0" distL="114300" distR="114300" simplePos="0" relativeHeight="251658240" behindDoc="1" locked="0" layoutInCell="1" allowOverlap="1" wp14:anchorId="7870E046" wp14:editId="7B9D32D1">
@@ -128,23 +129,7 @@
             <w:sz w:val="44"/>
             <w:szCs w:val="44"/>
           </w:rPr>
-          <w:t>wirelesswo</w:t>
-        </w:r>
-        <w:r>
-          <w:rPr>
-            <w:rStyle w:val="Hyperlink"/>
-            <w:sz w:val="44"/>
-            <w:szCs w:val="44"/>
-          </w:rPr>
-          <w:t>r</w:t>
-        </w:r>
-        <w:r>
-          <w:rPr>
-            <w:rStyle w:val="Hyperlink"/>
-            <w:sz w:val="44"/>
-            <w:szCs w:val="44"/>
-          </w:rPr>
-          <w:t>ks.it</w:t>
+          <w:t>wirelessworks.it</w:t>
         </w:r>
       </w:hyperlink>
     </w:p>
@@ -1760,10 +1745,27 @@
           <w:b/>
           <w:bCs/>
         </w:rPr>
-        <w:t>5-layer architecture</w:t>
-      </w:r>
-      <w:r>
-        <w:t>, wat betekent dat de back-end wordt opgebouwd uit vijf duidelijk gescheiden lagen. Deze lagen zijn:</w:t>
+        <w:t xml:space="preserve">5-layer </w:t>
+      </w:r>
+      <w:proofErr w:type="spellStart"/>
+      <w:r>
+        <w:rPr>
+          <w:b/>
+          <w:bCs/>
+        </w:rPr>
+        <w:t>architecture</w:t>
+      </w:r>
+      <w:proofErr w:type="spellEnd"/>
+      <w:r>
+        <w:t xml:space="preserve">, wat betekent dat de </w:t>
+      </w:r>
+      <w:proofErr w:type="spellStart"/>
+      <w:r>
+        <w:t>back-end</w:t>
+      </w:r>
+      <w:proofErr w:type="spellEnd"/>
+      <w:r>
+        <w:t xml:space="preserve"> wordt opgebouwd uit vijf duidelijk gescheiden lagen. Deze lagen zijn:</w:t>
       </w:r>
     </w:p>
     <w:p>
@@ -1774,7 +1776,15 @@
         </w:numPr>
       </w:pPr>
       <w:r>
-        <w:t>Presentation layer (routing)</w:t>
+        <w:t xml:space="preserve">Presentation </w:t>
+      </w:r>
+      <w:proofErr w:type="spellStart"/>
+      <w:r>
+        <w:t>layer</w:t>
+      </w:r>
+      <w:proofErr w:type="spellEnd"/>
+      <w:r>
+        <w:t xml:space="preserve"> (routing)</w:t>
       </w:r>
     </w:p>
     <w:p>
@@ -1785,7 +1795,15 @@
         </w:numPr>
       </w:pPr>
       <w:r>
-        <w:t>Application layer (service)</w:t>
+        <w:t xml:space="preserve">Application </w:t>
+      </w:r>
+      <w:proofErr w:type="spellStart"/>
+      <w:r>
+        <w:t>layer</w:t>
+      </w:r>
+      <w:proofErr w:type="spellEnd"/>
+      <w:r>
+        <w:t xml:space="preserve"> (service)</w:t>
       </w:r>
     </w:p>
     <w:p>
@@ -1796,8 +1814,13 @@
         </w:numPr>
       </w:pPr>
       <w:r>
-        <w:t>Business logic layer</w:t>
-      </w:r>
+        <w:t xml:space="preserve">Business logic </w:t>
+      </w:r>
+      <w:proofErr w:type="spellStart"/>
+      <w:r>
+        <w:t>layer</w:t>
+      </w:r>
+      <w:proofErr w:type="spellEnd"/>
     </w:p>
     <w:p>
       <w:pPr>
@@ -1807,8 +1830,13 @@
         </w:numPr>
       </w:pPr>
       <w:r>
-        <w:t>Data access layer</w:t>
-      </w:r>
+        <w:t xml:space="preserve">Data access </w:t>
+      </w:r>
+      <w:proofErr w:type="spellStart"/>
+      <w:r>
+        <w:t>layer</w:t>
+      </w:r>
+      <w:proofErr w:type="spellEnd"/>
     </w:p>
     <w:p>
       <w:pPr>
@@ -1818,12 +1846,33 @@
         </w:numPr>
       </w:pPr>
       <w:r>
-        <w:t>Database layer</w:t>
-      </w:r>
-    </w:p>
-    <w:p>
-      <w:r>
-        <w:t>Deze architectuur bevordert de onderhoudbaarheid, schaalbaarheid en testbaarheid van de applicatie. Doordat elke laag een eigen verantwoordelijkheid heeft (separation of concerns), blijft de code overzichtelijk en gestructureerd.</w:t>
+        <w:t xml:space="preserve">Database </w:t>
+      </w:r>
+      <w:proofErr w:type="spellStart"/>
+      <w:r>
+        <w:t>layer</w:t>
+      </w:r>
+      <w:proofErr w:type="spellEnd"/>
+    </w:p>
+    <w:p>
+      <w:r>
+        <w:t xml:space="preserve">Deze architectuur bevordert de </w:t>
+      </w:r>
+      <w:proofErr w:type="spellStart"/>
+      <w:r>
+        <w:t>onderhoudbaarheid</w:t>
+      </w:r>
+      <w:proofErr w:type="spellEnd"/>
+      <w:r>
+        <w:t>, schaalbaarheid en testbaarheid van de applicatie. Doordat elke laag een eigen verantwoordelijkheid heeft (</w:t>
+      </w:r>
+      <w:proofErr w:type="spellStart"/>
+      <w:r>
+        <w:t>separation</w:t>
+      </w:r>
+      <w:proofErr w:type="spellEnd"/>
+      <w:r>
+        <w:t xml:space="preserve"> of concerns), blijft de code overzichtelijk en gestructureerd.</w:t>
       </w:r>
     </w:p>
     <w:p>
@@ -1838,7 +1887,15 @@
     </w:p>
     <w:p>
       <w:r>
-        <w:t>Tot slot vergemakkelijkt deze architectuur het testen van de applicatie. Omdat de lagen logisch zijn gescheiden, kunnen ze afzonderlijk worden getest (unit testing), wat bijdraagt aan een hogere codekwaliteit en een veiligere, betrouwbaardere applicatie.</w:t>
+        <w:t xml:space="preserve">Tot slot vergemakkelijkt deze architectuur het testen van de applicatie. Omdat de lagen logisch zijn gescheiden, kunnen ze afzonderlijk worden getest (unit </w:t>
+      </w:r>
+      <w:proofErr w:type="spellStart"/>
+      <w:r>
+        <w:t>testing</w:t>
+      </w:r>
+      <w:proofErr w:type="spellEnd"/>
+      <w:r>
+        <w:t>), wat bijdraagt aan een hogere codekwaliteit en een veiligere, betrouwbaardere applicatie.</w:t>
       </w:r>
     </w:p>
     <w:p/>
@@ -1867,9 +1924,11 @@
         <w:pStyle w:val="Kop2"/>
       </w:pPr>
       <w:bookmarkStart w:id="3" w:name="_Toc222393014"/>
+      <w:proofErr w:type="spellStart"/>
       <w:r>
         <w:t>Navbar</w:t>
       </w:r>
+      <w:proofErr w:type="spellEnd"/>
       <w:r>
         <w:t>.</w:t>
       </w:r>
@@ -1881,7 +1940,15 @@
       </w:pPr>
       <w:bookmarkStart w:id="4" w:name="_Toc222393015"/>
       <w:r>
-        <w:t>Hoe ziet de navbar er nu uit?</w:t>
+        <w:t xml:space="preserve">Hoe ziet de </w:t>
+      </w:r>
+      <w:proofErr w:type="spellStart"/>
+      <w:r>
+        <w:t>navbar</w:t>
+      </w:r>
+      <w:proofErr w:type="spellEnd"/>
+      <w:r>
+        <w:t xml:space="preserve"> er nu uit?</w:t>
       </w:r>
       <w:bookmarkEnd w:id="4"/>
     </w:p>
@@ -2053,7 +2120,15 @@
       <w:bookmarkStart w:id="7" w:name="_Toc222393018"/>
       <w:r>
         <w:lastRenderedPageBreak/>
-        <w:t>Smart-Iot-Gateway-Scan moderniseren</w:t>
+        <w:t>Smart-</w:t>
+      </w:r>
+      <w:proofErr w:type="spellStart"/>
+      <w:r>
+        <w:t>Iot</w:t>
+      </w:r>
+      <w:proofErr w:type="spellEnd"/>
+      <w:r>
+        <w:t>-Gateway-Scan moderniseren</w:t>
       </w:r>
       <w:bookmarkEnd w:id="7"/>
     </w:p>
@@ -2069,7 +2144,23 @@
     </w:p>
     <w:p>
       <w:r>
-        <w:t>Op dit moment is de Smart-IoT-Gateway-Scan een stream die vanaf twitch wordt gestreamd op de website.</w:t>
+        <w:t>Op dit moment is de Smart-</w:t>
+      </w:r>
+      <w:proofErr w:type="spellStart"/>
+      <w:r>
+        <w:t>IoT</w:t>
+      </w:r>
+      <w:proofErr w:type="spellEnd"/>
+      <w:r>
+        <w:t xml:space="preserve">-Gateway-Scan een stream die vanaf </w:t>
+      </w:r>
+      <w:proofErr w:type="spellStart"/>
+      <w:r>
+        <w:t>twitch</w:t>
+      </w:r>
+      <w:proofErr w:type="spellEnd"/>
+      <w:r>
+        <w:t xml:space="preserve"> wordt gestreamd op de website.</w:t>
       </w:r>
     </w:p>
     <w:p>
@@ -2084,7 +2175,15 @@
     </w:p>
     <w:p>
       <w:r>
-        <w:t>Ik wil een moderne versie maken van deze scan. Ik wil het zo maken dat ik compleet van Twitch als tussen persoon af ben. Dit betekend dat ik de data uit een API wil halen en deze rechtstreeks tonen op de homepagina. Documentatie over de backend API staat verderop en deze handleiding en is te vinden in de inhoudsopgave.</w:t>
+        <w:t xml:space="preserve">Ik wil een moderne versie maken van deze scan. Ik wil het zo maken dat ik compleet van </w:t>
+      </w:r>
+      <w:proofErr w:type="spellStart"/>
+      <w:r>
+        <w:t>Twitch</w:t>
+      </w:r>
+      <w:proofErr w:type="spellEnd"/>
+      <w:r>
+        <w:t xml:space="preserve"> als tussen persoon af ben. Dit betekend dat ik de data uit een API wil halen en deze rechtstreeks tonen op de homepagina. Documentatie over de backend API staat verderop en deze handleiding en is te vinden in de inhoudsopgave.</w:t>
       </w:r>
     </w:p>
     <w:p>
@@ -2099,7 +2198,31 @@
     </w:p>
     <w:p>
       <w:r>
-        <w:t>Ik wil (indien mogelijk) in de rootfolder (homefolder) van de frontend een config.env aanmaken waarin ik een gebruikersnaam en wachtwoord zet welke worden meegestuurd met elke request naar de API.</w:t>
+        <w:t xml:space="preserve">Ik wil (indien mogelijk) in de rootfolder (homefolder) van de </w:t>
+      </w:r>
+      <w:proofErr w:type="spellStart"/>
+      <w:r>
+        <w:t>frontend</w:t>
+      </w:r>
+      <w:proofErr w:type="spellEnd"/>
+      <w:r>
+        <w:t xml:space="preserve"> een </w:t>
+      </w:r>
+      <w:proofErr w:type="spellStart"/>
+      <w:r>
+        <w:t>config.env</w:t>
+      </w:r>
+      <w:proofErr w:type="spellEnd"/>
+      <w:r>
+        <w:t xml:space="preserve"> aanmaken waarin ik een gebruikersnaam en wachtwoord zet welke worden meegestuurd met elke </w:t>
+      </w:r>
+      <w:proofErr w:type="spellStart"/>
+      <w:r>
+        <w:t>request</w:t>
+      </w:r>
+      <w:proofErr w:type="spellEnd"/>
+      <w:r>
+        <w:t xml:space="preserve"> naar de API.</w:t>
       </w:r>
     </w:p>
     <w:p>
@@ -2107,8 +2230,13 @@
         <w:pStyle w:val="Kop3"/>
       </w:pPr>
       <w:bookmarkStart w:id="11" w:name="_Toc222393022"/>
-      <w:r>
-        <w:t>Sequence diagram</w:t>
+      <w:proofErr w:type="spellStart"/>
+      <w:r>
+        <w:t>Sequence</w:t>
+      </w:r>
+      <w:proofErr w:type="spellEnd"/>
+      <w:r>
+        <w:t xml:space="preserve"> diagram</w:t>
       </w:r>
       <w:bookmarkEnd w:id="11"/>
       <w:r>
@@ -2170,8 +2298,11 @@
         </w:drawing>
       </w:r>
     </w:p>
-    <w:p/>
-    <w:p/>
+    <w:p>
+      <w:pPr>
+        <w:pStyle w:val="Kop3"/>
+      </w:pPr>
+    </w:p>
     <w:p/>
     <w:p/>
     <w:p/>
@@ -2182,13 +2313,45 @@
       <w:bookmarkStart w:id="12" w:name="_Toc222393023"/>
       <w:r>
         <w:lastRenderedPageBreak/>
-        <w:t>Grafiek Smart-IoT-Gateway-Scan</w:t>
+        <w:t>Grafiek Smart-</w:t>
+      </w:r>
+      <w:proofErr w:type="spellStart"/>
+      <w:r>
+        <w:t>IoT</w:t>
+      </w:r>
+      <w:proofErr w:type="spellEnd"/>
+      <w:r>
+        <w:t>-Gateway-Scan</w:t>
       </w:r>
       <w:bookmarkEnd w:id="12"/>
     </w:p>
     <w:p>
       <w:r>
-        <w:t xml:space="preserve">De Smart-IoT-Gateway-Scan wil ik uit een API laten zien, maar ik wil hem ook een grafiek laten zien van deze scan vanuit een API. Deze API stuurt ieder uur een request naar de back-end en deze krijgt 1 nummer terug en dit zijn het aantal apparaten dat gescand zijn in dat afgelopen uur. </w:t>
+        <w:t>De Smart-</w:t>
+      </w:r>
+      <w:proofErr w:type="spellStart"/>
+      <w:r>
+        <w:t>IoT</w:t>
+      </w:r>
+      <w:proofErr w:type="spellEnd"/>
+      <w:r>
+        <w:t xml:space="preserve">-Gateway-Scan wil ik uit een API laten zien, maar ik wil hem ook een grafiek laten zien van deze scan vanuit een API. Deze API stuurt ieder uur een </w:t>
+      </w:r>
+      <w:proofErr w:type="spellStart"/>
+      <w:r>
+        <w:t>request</w:t>
+      </w:r>
+      <w:proofErr w:type="spellEnd"/>
+      <w:r>
+        <w:t xml:space="preserve"> naar de </w:t>
+      </w:r>
+      <w:proofErr w:type="spellStart"/>
+      <w:r>
+        <w:t>back-end</w:t>
+      </w:r>
+      <w:proofErr w:type="spellEnd"/>
+      <w:r>
+        <w:t xml:space="preserve"> en deze krijgt 1 nummer terug en dit zijn het aantal apparaten dat gescand zijn in dat afgelopen uur. </w:t>
       </w:r>
     </w:p>
     <w:p>
@@ -2197,13 +2360,50 @@
       </w:pPr>
       <w:bookmarkStart w:id="13" w:name="_Toc222393024"/>
       <w:r>
-        <w:t>Framework en libraries</w:t>
+        <w:t xml:space="preserve">Framework en </w:t>
+      </w:r>
+      <w:proofErr w:type="spellStart"/>
+      <w:r>
+        <w:t>libraries</w:t>
       </w:r>
       <w:bookmarkEnd w:id="13"/>
-    </w:p>
-    <w:p>
-      <w:r>
-        <w:t>Ik wil deze grafiek realiseren met python en met de library Matploblib, echter weet ik niet wat er op dit moment wordt gebruikt voor codetaal of eventuele frameworks binnen het bedrijf. Als ik dat zeker weet kan ik pas met zekerheid zeggen welke library ik hiervoor kan gebruiken.</w:t>
+      <w:proofErr w:type="spellEnd"/>
+    </w:p>
+    <w:p>
+      <w:r>
+        <w:t xml:space="preserve">Ik wil deze grafiek realiseren met python en met de </w:t>
+      </w:r>
+      <w:proofErr w:type="spellStart"/>
+      <w:r>
+        <w:t>library</w:t>
+      </w:r>
+      <w:proofErr w:type="spellEnd"/>
+      <w:r>
+        <w:t xml:space="preserve"> </w:t>
+      </w:r>
+      <w:proofErr w:type="spellStart"/>
+      <w:r>
+        <w:t>Matploblib</w:t>
+      </w:r>
+      <w:proofErr w:type="spellEnd"/>
+      <w:r>
+        <w:t xml:space="preserve">, echter weet ik niet wat er op dit moment wordt gebruikt voor codetaal of eventuele </w:t>
+      </w:r>
+      <w:proofErr w:type="spellStart"/>
+      <w:r>
+        <w:t>frameworks</w:t>
+      </w:r>
+      <w:proofErr w:type="spellEnd"/>
+      <w:r>
+        <w:t xml:space="preserve"> binnen het bedrijf. Als ik dat zeker weet kan ik pas met zekerheid zeggen welke </w:t>
+      </w:r>
+      <w:proofErr w:type="spellStart"/>
+      <w:r>
+        <w:t>library</w:t>
+      </w:r>
+      <w:proofErr w:type="spellEnd"/>
+      <w:r>
+        <w:t xml:space="preserve"> ik hiervoor kan gebruiken.</w:t>
       </w:r>
     </w:p>
     <w:p>
@@ -2218,15 +2418,36 @@
     </w:p>
     <w:p>
       <w:r>
-        <w:t>Net zoals in de vorige vraagstelling wil ik in de rootfolder (homefolder) een config.env fil e maken waarin een gebruikersnaam en wachtwoord staan die mee wordt gestuurd in de get request naar de backend.</w:t>
+        <w:t xml:space="preserve">Net zoals in de vorige vraagstelling wil ik in de rootfolder (homefolder) een </w:t>
+      </w:r>
+      <w:proofErr w:type="spellStart"/>
+      <w:r>
+        <w:t>config.env</w:t>
+      </w:r>
+      <w:proofErr w:type="spellEnd"/>
+      <w:r>
+        <w:t xml:space="preserve"> fil e maken waarin een gebruikersnaam en wachtwoord staan die mee wordt gestuurd in de get </w:t>
+      </w:r>
+      <w:proofErr w:type="spellStart"/>
+      <w:r>
+        <w:t>request</w:t>
+      </w:r>
+      <w:proofErr w:type="spellEnd"/>
+      <w:r>
+        <w:t xml:space="preserve"> naar de backend.</w:t>
       </w:r>
     </w:p>
     <w:p>
       <w:pPr>
         <w:pStyle w:val="Kop3"/>
       </w:pPr>
-      <w:r>
-        <w:t>Sequence diagram</w:t>
+      <w:proofErr w:type="spellStart"/>
+      <w:r>
+        <w:t>Sequence</w:t>
+      </w:r>
+      <w:proofErr w:type="spellEnd"/>
+      <w:r>
+        <w:t xml:space="preserve"> diagram</w:t>
       </w:r>
     </w:p>
     <w:p>
@@ -2310,13 +2531,37 @@
       </w:pPr>
       <w:bookmarkStart w:id="16" w:name="_Toc222393027"/>
       <w:r>
-        <w:t>Smart-IoT-Gateway-Scan halen uit een API</w:t>
+        <w:t>Smart-</w:t>
+      </w:r>
+      <w:proofErr w:type="spellStart"/>
+      <w:r>
+        <w:t>IoT</w:t>
+      </w:r>
+      <w:proofErr w:type="spellEnd"/>
+      <w:r>
+        <w:t>-Gateway-Scan halen uit een API</w:t>
       </w:r>
       <w:bookmarkEnd w:id="16"/>
     </w:p>
     <w:p>
       <w:r>
-        <w:t>Zoals eerder vernoemd wil ik de Smart-IoT-Gateway-Scan uit een API gaan halen, zodat deze via een sectie op de website gezien kan laten worden op de homepage van de website I.P.V een livestream vanuit Twitch.</w:t>
+        <w:t>Zoals eerder vernoemd wil ik de Smart-</w:t>
+      </w:r>
+      <w:proofErr w:type="spellStart"/>
+      <w:r>
+        <w:t>IoT</w:t>
+      </w:r>
+      <w:proofErr w:type="spellEnd"/>
+      <w:r>
+        <w:t xml:space="preserve">-Gateway-Scan uit een API gaan halen, zodat deze via een sectie op de website gezien kan laten worden op de homepage van de website I.P.V een livestream vanuit </w:t>
+      </w:r>
+      <w:proofErr w:type="spellStart"/>
+      <w:r>
+        <w:t>Twitch</w:t>
+      </w:r>
+      <w:proofErr w:type="spellEnd"/>
+      <w:r>
+        <w:t>.</w:t>
       </w:r>
       <w:r>
         <w:br/>
@@ -2332,7 +2577,23 @@
     </w:p>
     <w:p>
       <w:r>
-        <w:t>De API’s die ik ga ontwikkelen binnen mijn stageperiode ga ik maken met Python in het ‘Django’ framework.</w:t>
+        <w:t xml:space="preserve">De </w:t>
+      </w:r>
+      <w:proofErr w:type="spellStart"/>
+      <w:r>
+        <w:t>API’s</w:t>
+      </w:r>
+      <w:proofErr w:type="spellEnd"/>
+      <w:r>
+        <w:t xml:space="preserve"> die ik ga ontwikkelen binnen mijn stageperiode ga ik maken met Python in het ‘Django’ </w:t>
+      </w:r>
+      <w:proofErr w:type="spellStart"/>
+      <w:r>
+        <w:t>framework</w:t>
+      </w:r>
+      <w:proofErr w:type="spellEnd"/>
+      <w:r>
+        <w:t>.</w:t>
       </w:r>
     </w:p>
     <w:p>
@@ -2355,11 +2616,29 @@
       <w:r>
         <w:t xml:space="preserve"> zitten bij een API die op een live pagina wordt gebruikt. Om dit zo veilig mogelijk te maken wil ik in de rootfolder (homefolder) voor de </w:t>
       </w:r>
+      <w:proofErr w:type="spellStart"/>
       <w:r>
         <w:t>Api’s</w:t>
       </w:r>
-      <w:r>
-        <w:t xml:space="preserve"> een config.env plaatsen. Hierin wil ik natuurlijk een gebruikersnaam en een wachtwoord plaatsen voor de database, maar ook een gebruikersnaam en wachtwoord die ik verwacht in een request header vanuit de </w:t>
+      <w:proofErr w:type="spellEnd"/>
+      <w:r>
+        <w:t xml:space="preserve"> een </w:t>
+      </w:r>
+      <w:proofErr w:type="spellStart"/>
+      <w:r>
+        <w:t>config.env</w:t>
+      </w:r>
+      <w:proofErr w:type="spellEnd"/>
+      <w:r>
+        <w:t xml:space="preserve"> plaatsen. Hierin wil ik natuurlijk een gebruikersnaam en een wachtwoord plaatsen voor de database, maar ook een gebruikersnaam en wachtwoord die ik verwacht in een </w:t>
+      </w:r>
+      <w:proofErr w:type="spellStart"/>
+      <w:r>
+        <w:t>request</w:t>
+      </w:r>
+      <w:proofErr w:type="spellEnd"/>
+      <w:r>
+        <w:t xml:space="preserve"> header vanuit de </w:t>
       </w:r>
       <w:r>
         <w:t>front-end</w:t>
@@ -2388,7 +2667,15 @@
       <w:bookmarkStart w:id="18" w:name="_Toc222393029"/>
       <w:r>
         <w:lastRenderedPageBreak/>
-        <w:t>Grafiek maken van Smart-IoT-Gateway-Scan</w:t>
+        <w:t>Grafiek maken van Smart-</w:t>
+      </w:r>
+      <w:proofErr w:type="spellStart"/>
+      <w:r>
+        <w:t>IoT</w:t>
+      </w:r>
+      <w:proofErr w:type="spellEnd"/>
+      <w:r>
+        <w:t>-Gateway-Scan</w:t>
       </w:r>
       <w:bookmarkEnd w:id="18"/>
     </w:p>
@@ -2418,7 +2705,31 @@
     </w:p>
     <w:p>
       <w:r>
-        <w:t>Ook dit wil ik op een zelfde manier aanpakken als de bovenstaande vraag kwa security. Ook hier wil ik in een config.env bestand zetten wellke gebruikersnaam en welk wachtwoord er moeten worden opgevraagd in de front-end.</w:t>
+        <w:t xml:space="preserve">Ook dit wil ik op een zelfde manier aanpakken als de bovenstaande vraag </w:t>
+      </w:r>
+      <w:proofErr w:type="spellStart"/>
+      <w:r>
+        <w:t>kwa</w:t>
+      </w:r>
+      <w:proofErr w:type="spellEnd"/>
+      <w:r>
+        <w:t xml:space="preserve"> security. Ook hier wil ik in een </w:t>
+      </w:r>
+      <w:proofErr w:type="spellStart"/>
+      <w:r>
+        <w:t>config.env</w:t>
+      </w:r>
+      <w:proofErr w:type="spellEnd"/>
+      <w:r>
+        <w:t xml:space="preserve"> bestand zetten </w:t>
+      </w:r>
+      <w:proofErr w:type="spellStart"/>
+      <w:r>
+        <w:t>wellke</w:t>
+      </w:r>
+      <w:proofErr w:type="spellEnd"/>
+      <w:r>
+        <w:t xml:space="preserve"> gebruikersnaam en welk wachtwoord er moeten worden opgevraagd in de front-end.</w:t>
       </w:r>
     </w:p>
     <w:p/>
@@ -2545,47 +2856,52 @@
           <w:b/>
           <w:bCs/>
         </w:rPr>
-        <w:t>Technische uitwerking van de live Smart-IoT-Gateway-Scan</w:t>
-      </w:r>
-    </w:p>
-    <w:p>
-      <w:r>
-        <w:t>Het systeem voor de Smart-IoT-Gateway-Scan is opgebouwd volgens een 5-layer architecture en bestaat uit twee parallelle processen: een live weergave van gescande Bluetooth-apparaten en een uuraggregatie voor statistische opslag. Door deze processen van elkaar te scheiden wordt zowel real-time functionaliteit als efficiënte dataopslag gerealiseerd.</w:t>
-      </w:r>
-    </w:p>
-    <w:p>
-      <w:pPr>
+        <w:t>Technische uitwerking van de live Smart-</w:t>
+      </w:r>
+      <w:proofErr w:type="spellStart"/>
+      <w:r>
         <w:rPr>
           <w:b/>
           <w:bCs/>
         </w:rPr>
-      </w:pPr>
+        <w:t>IoT</w:t>
+      </w:r>
+      <w:proofErr w:type="spellEnd"/>
       <w:r>
         <w:rPr>
           <w:b/>
           <w:bCs/>
         </w:rPr>
-        <w:t>Live weergave via WebSocket</w:t>
-      </w:r>
-    </w:p>
-    <w:p>
-      <w:r>
-        <w:t>Wanneer een gebruiker de homepage opent, wordt een WebSocket-verbinding opgezet tussen de frontend en de backend. Tijdens het tot stand brengen van deze verbinding vindt authenticatie plaats. Na succesvolle validatie blijft de verbinding actief als een persistent, bidirectioneel communicatiekanaal.</w:t>
-      </w:r>
-    </w:p>
-    <w:p>
-      <w:r>
-        <w:t>Wanneer het Bluetooth-scanproces (uitgevoerd via CMD) een nieuw apparaat detecteert, wordt dit scan-event doorgestuurd naar de backend. De Application Layer ontvangt dit event en stuurt het door naar de Business Logic Layer. Binnen deze laag wordt het scan-event gevalideerd, bijvoorbeeld door controle op duplicaten of ongeldige data.</w:t>
-      </w:r>
-    </w:p>
-    <w:p>
-      <w:r>
-        <w:t>Na succesvolle validatie wordt een in-memory teller verhoogd. Vervolgens wordt het scan-event via de Presentation Layer direct doorgestuurd naar alle actieve WebSocket-clients. Hierdoor wordt het gescande apparaat real-time weergegeven op de homepage, zonder dat de pagina opnieuw geladen hoeft te worden.</w:t>
-      </w:r>
-    </w:p>
-    <w:p>
-      <w:r>
-        <w:t>Belangrijk hierbij is dat individuele scan-events niet in de database worden opgeslagen. De live communicatie verloopt volledig via WebSocket, waardoor de database niet wordt belast met grote hoeveelheden real-time data.</w:t>
+        <w:t>-Gateway-Scan</w:t>
+      </w:r>
+    </w:p>
+    <w:p>
+      <w:r>
+        <w:t>Het systeem voor de Smart-</w:t>
+      </w:r>
+      <w:proofErr w:type="spellStart"/>
+      <w:r>
+        <w:t>IoT</w:t>
+      </w:r>
+      <w:proofErr w:type="spellEnd"/>
+      <w:r>
+        <w:t xml:space="preserve">-Gateway-Scan is opgebouwd volgens een 5-layer </w:t>
+      </w:r>
+      <w:proofErr w:type="spellStart"/>
+      <w:r>
+        <w:t>architecture</w:t>
+      </w:r>
+      <w:proofErr w:type="spellEnd"/>
+      <w:r>
+        <w:t xml:space="preserve"> en bestaat uit twee parallelle processen: een live weergave van gescande Bluetooth-apparaten en een </w:t>
+      </w:r>
+      <w:proofErr w:type="spellStart"/>
+      <w:r>
+        <w:t>uuraggregatie</w:t>
+      </w:r>
+      <w:proofErr w:type="spellEnd"/>
+      <w:r>
+        <w:t xml:space="preserve"> voor statistische opslag. Door deze processen van elkaar te scheiden wordt zowel real-time functionaliteit als efficiënte dataopslag gerealiseerd.</w:t>
       </w:r>
     </w:p>
     <w:p>
@@ -2600,7 +2916,124 @@
           <w:b/>
           <w:bCs/>
         </w:rPr>
-        <w:t>Hourly counter en statistische opslag</w:t>
+        <w:t xml:space="preserve">Live weergave via </w:t>
+      </w:r>
+      <w:proofErr w:type="spellStart"/>
+      <w:r>
+        <w:rPr>
+          <w:b/>
+          <w:bCs/>
+        </w:rPr>
+        <w:t>WebSocket</w:t>
+      </w:r>
+      <w:proofErr w:type="spellEnd"/>
+    </w:p>
+    <w:p>
+      <w:r>
+        <w:t xml:space="preserve">Wanneer een gebruiker de homepage opent, wordt een </w:t>
+      </w:r>
+      <w:proofErr w:type="spellStart"/>
+      <w:r>
+        <w:t>WebSocket</w:t>
+      </w:r>
+      <w:proofErr w:type="spellEnd"/>
+      <w:r>
+        <w:t xml:space="preserve">-verbinding opgezet tussen de </w:t>
+      </w:r>
+      <w:proofErr w:type="spellStart"/>
+      <w:r>
+        <w:t>frontend</w:t>
+      </w:r>
+      <w:proofErr w:type="spellEnd"/>
+      <w:r>
+        <w:t xml:space="preserve"> en de backend. Tijdens het tot stand brengen van deze verbinding vindt authenticatie plaats. Na succesvolle validatie blijft de verbinding actief als een persistent, </w:t>
+      </w:r>
+      <w:proofErr w:type="spellStart"/>
+      <w:r>
+        <w:t>bidirectioneel</w:t>
+      </w:r>
+      <w:proofErr w:type="spellEnd"/>
+      <w:r>
+        <w:t xml:space="preserve"> communicatiekanaal.</w:t>
+      </w:r>
+    </w:p>
+    <w:p>
+      <w:r>
+        <w:t xml:space="preserve">Wanneer het Bluetooth-scanproces (uitgevoerd via CMD) een nieuw apparaat detecteert, wordt dit scan-event doorgestuurd naar de backend. De Application </w:t>
+      </w:r>
+      <w:proofErr w:type="spellStart"/>
+      <w:r>
+        <w:t>Layer</w:t>
+      </w:r>
+      <w:proofErr w:type="spellEnd"/>
+      <w:r>
+        <w:t xml:space="preserve"> ontvangt dit event en stuurt het door naar de Business Logic </w:t>
+      </w:r>
+      <w:proofErr w:type="spellStart"/>
+      <w:r>
+        <w:t>Layer</w:t>
+      </w:r>
+      <w:proofErr w:type="spellEnd"/>
+      <w:r>
+        <w:t>. Binnen deze laag wordt het scan-event gevalideerd, bijvoorbeeld door controle op duplicaten of ongeldige data.</w:t>
+      </w:r>
+    </w:p>
+    <w:p>
+      <w:r>
+        <w:t xml:space="preserve">Na succesvolle validatie wordt een in-memory teller verhoogd. Vervolgens wordt het scan-event via de Presentation </w:t>
+      </w:r>
+      <w:proofErr w:type="spellStart"/>
+      <w:r>
+        <w:t>Layer</w:t>
+      </w:r>
+      <w:proofErr w:type="spellEnd"/>
+      <w:r>
+        <w:t xml:space="preserve"> direct doorgestuurd naar alle actieve </w:t>
+      </w:r>
+      <w:proofErr w:type="spellStart"/>
+      <w:r>
+        <w:t>WebSocket</w:t>
+      </w:r>
+      <w:proofErr w:type="spellEnd"/>
+      <w:r>
+        <w:t>-clients. Hierdoor wordt het gescande apparaat real-time weergegeven op de homepage, zonder dat de pagina opnieuw geladen hoeft te worden.</w:t>
+      </w:r>
+    </w:p>
+    <w:p>
+      <w:r>
+        <w:t xml:space="preserve">Belangrijk hierbij is dat individuele scan-events niet in de database worden opgeslagen. De live communicatie verloopt volledig via </w:t>
+      </w:r>
+      <w:proofErr w:type="spellStart"/>
+      <w:r>
+        <w:t>WebSocket</w:t>
+      </w:r>
+      <w:proofErr w:type="spellEnd"/>
+      <w:r>
+        <w:t>, waardoor de database niet wordt belast met grote hoeveelheden real-time data.</w:t>
+      </w:r>
+    </w:p>
+    <w:p>
+      <w:pPr>
+        <w:rPr>
+          <w:b/>
+          <w:bCs/>
+        </w:rPr>
+      </w:pPr>
+      <w:proofErr w:type="spellStart"/>
+      <w:r>
+        <w:rPr>
+          <w:b/>
+          <w:bCs/>
+        </w:rPr>
+        <w:t>Hourly</w:t>
+      </w:r>
+      <w:proofErr w:type="spellEnd"/>
+      <w:r>
+        <w:rPr>
+          <w:b/>
+          <w:bCs/>
+        </w:rPr>
+        <w:t xml:space="preserve"> counter en statistische opslag</w:t>
       </w:r>
     </w:p>
     <w:p>
@@ -2610,12 +3043,68 @@
     </w:p>
     <w:p>
       <w:r>
-        <w:t>Aan het einde van ieder uur wordt door middel van een scheduler een opslagproces geactiveerd. De Application Layer vraagt de Business Logic Layer om de huidige tellerwaarde op te halen. Vervolgens wordt de teller gereset naar nul voor het nieuwe uur.</w:t>
-      </w:r>
-    </w:p>
-    <w:p>
-      <w:r>
-        <w:t>De Data Access Layer slaat uitsluitend het uurtotaal op in de database. De database bevat dus enkel geaggregeerde gegevens (uurtotalen) en geen individuele scan-events. Deze opgeslagen totalen worden later gebruikt voor het genereren van statistieken en grafieken, bijvoorbeeld met behulp van een visualisatiebibliotheek zoals Matplotlib.</w:t>
+        <w:t xml:space="preserve">Aan het einde van ieder uur wordt door middel van een </w:t>
+      </w:r>
+      <w:proofErr w:type="spellStart"/>
+      <w:r>
+        <w:t>scheduler</w:t>
+      </w:r>
+      <w:proofErr w:type="spellEnd"/>
+      <w:r>
+        <w:t xml:space="preserve"> een opslagproces geactiveerd. De Application </w:t>
+      </w:r>
+      <w:proofErr w:type="spellStart"/>
+      <w:r>
+        <w:t>Layer</w:t>
+      </w:r>
+      <w:proofErr w:type="spellEnd"/>
+      <w:r>
+        <w:t xml:space="preserve"> vraagt de Business Logic </w:t>
+      </w:r>
+      <w:proofErr w:type="spellStart"/>
+      <w:r>
+        <w:t>Layer</w:t>
+      </w:r>
+      <w:proofErr w:type="spellEnd"/>
+      <w:r>
+        <w:t xml:space="preserve"> om de huidige </w:t>
+      </w:r>
+      <w:proofErr w:type="spellStart"/>
+      <w:r>
+        <w:t>tellerwaarde</w:t>
+      </w:r>
+      <w:proofErr w:type="spellEnd"/>
+      <w:r>
+        <w:t xml:space="preserve"> op te halen. Vervolgens wordt de teller gereset naar nul voor het nieuwe uur.</w:t>
+      </w:r>
+    </w:p>
+    <w:p>
+      <w:r>
+        <w:t xml:space="preserve">De Data Access </w:t>
+      </w:r>
+      <w:proofErr w:type="spellStart"/>
+      <w:r>
+        <w:t>Layer</w:t>
+      </w:r>
+      <w:proofErr w:type="spellEnd"/>
+      <w:r>
+        <w:t xml:space="preserve"> slaat uitsluitend het </w:t>
+      </w:r>
+      <w:proofErr w:type="spellStart"/>
+      <w:r>
+        <w:t>uurtotaal</w:t>
+      </w:r>
+      <w:proofErr w:type="spellEnd"/>
+      <w:r>
+        <w:t xml:space="preserve"> op in de database. De database bevat dus enkel geaggregeerde gegevens (</w:t>
+      </w:r>
+      <w:proofErr w:type="spellStart"/>
+      <w:r>
+        <w:t>uurtotalen</w:t>
+      </w:r>
+      <w:proofErr w:type="spellEnd"/>
+      <w:r>
+        <w:t>) en geen individuele scan-events. Deze opgeslagen totalen worden later gebruikt voor het genereren van statistieken en grafieken, bijvoorbeeld met behulp van een visualisatiebibliotheek zoals Matplotlib.</w:t>
       </w:r>
     </w:p>
     <w:p>
@@ -2631,8 +3120,17 @@
           <w:bCs/>
         </w:rPr>
         <w:lastRenderedPageBreak/>
-        <w:t>Verdeling binnen de 5-layer architecture</w:t>
-      </w:r>
+        <w:t xml:space="preserve">Verdeling binnen de 5-layer </w:t>
+      </w:r>
+      <w:proofErr w:type="spellStart"/>
+      <w:r>
+        <w:rPr>
+          <w:b/>
+          <w:bCs/>
+        </w:rPr>
+        <w:t>architecture</w:t>
+      </w:r>
+      <w:proofErr w:type="spellEnd"/>
     </w:p>
     <w:p>
       <w:r>
@@ -2651,10 +3149,34 @@
           <w:b/>
           <w:bCs/>
         </w:rPr>
-        <w:t>Presentation Layer:</w:t>
-      </w:r>
-      <w:r>
-        <w:t xml:space="preserve"> Beheert de WebSocket-verbinding en verzorgt het verzenden van live updates naar clients.</w:t>
+        <w:t xml:space="preserve">Presentation </w:t>
+      </w:r>
+      <w:proofErr w:type="spellStart"/>
+      <w:r>
+        <w:rPr>
+          <w:b/>
+          <w:bCs/>
+        </w:rPr>
+        <w:t>Layer</w:t>
+      </w:r>
+      <w:proofErr w:type="spellEnd"/>
+      <w:r>
+        <w:rPr>
+          <w:b/>
+          <w:bCs/>
+        </w:rPr>
+        <w:t>:</w:t>
+      </w:r>
+      <w:r>
+        <w:t xml:space="preserve"> Beheert de </w:t>
+      </w:r>
+      <w:proofErr w:type="spellStart"/>
+      <w:r>
+        <w:t>WebSocket</w:t>
+      </w:r>
+      <w:proofErr w:type="spellEnd"/>
+      <w:r>
+        <w:t>-verbinding en verzorgt het verzenden van live updates naar clients.</w:t>
       </w:r>
     </w:p>
     <w:p>
@@ -2669,7 +3191,23 @@
           <w:b/>
           <w:bCs/>
         </w:rPr>
-        <w:t>Application Layer:</w:t>
+        <w:t xml:space="preserve">Application </w:t>
+      </w:r>
+      <w:proofErr w:type="spellStart"/>
+      <w:r>
+        <w:rPr>
+          <w:b/>
+          <w:bCs/>
+        </w:rPr>
+        <w:t>Layer</w:t>
+      </w:r>
+      <w:proofErr w:type="spellEnd"/>
+      <w:r>
+        <w:rPr>
+          <w:b/>
+          <w:bCs/>
+        </w:rPr>
+        <w:t>:</w:t>
       </w:r>
       <w:r>
         <w:t xml:space="preserve"> Orkestreert scan-events en coördineert het uur-opslagproces.</w:t>
@@ -2687,10 +3225,34 @@
           <w:b/>
           <w:bCs/>
         </w:rPr>
-        <w:t>Business Logic Layer:</w:t>
-      </w:r>
-      <w:r>
-        <w:t xml:space="preserve"> Valideert scan-events en beheert de in-memory hour counter.</w:t>
+        <w:t xml:space="preserve">Business Logic </w:t>
+      </w:r>
+      <w:proofErr w:type="spellStart"/>
+      <w:r>
+        <w:rPr>
+          <w:b/>
+          <w:bCs/>
+        </w:rPr>
+        <w:t>Layer</w:t>
+      </w:r>
+      <w:proofErr w:type="spellEnd"/>
+      <w:r>
+        <w:rPr>
+          <w:b/>
+          <w:bCs/>
+        </w:rPr>
+        <w:t>:</w:t>
+      </w:r>
+      <w:r>
+        <w:t xml:space="preserve"> Valideert scan-events en beheert de in-memory </w:t>
+      </w:r>
+      <w:proofErr w:type="spellStart"/>
+      <w:r>
+        <w:t>hour</w:t>
+      </w:r>
+      <w:proofErr w:type="spellEnd"/>
+      <w:r>
+        <w:t xml:space="preserve"> counter.</w:t>
       </w:r>
     </w:p>
     <w:p>
@@ -2705,10 +3267,34 @@
           <w:b/>
           <w:bCs/>
         </w:rPr>
-        <w:t>Data Access Layer:</w:t>
-      </w:r>
-      <w:r>
-        <w:t xml:space="preserve"> Verzorgt de opslag van uurtotalen in de database.</w:t>
+        <w:t xml:space="preserve">Data Access </w:t>
+      </w:r>
+      <w:proofErr w:type="spellStart"/>
+      <w:r>
+        <w:rPr>
+          <w:b/>
+          <w:bCs/>
+        </w:rPr>
+        <w:t>Layer</w:t>
+      </w:r>
+      <w:proofErr w:type="spellEnd"/>
+      <w:r>
+        <w:rPr>
+          <w:b/>
+          <w:bCs/>
+        </w:rPr>
+        <w:t>:</w:t>
+      </w:r>
+      <w:r>
+        <w:t xml:space="preserve"> Verzorgt de opslag van </w:t>
+      </w:r>
+      <w:proofErr w:type="spellStart"/>
+      <w:r>
+        <w:t>uurtotalen</w:t>
+      </w:r>
+      <w:proofErr w:type="spellEnd"/>
+      <w:r>
+        <w:t xml:space="preserve"> in de database.</w:t>
       </w:r>
     </w:p>
     <w:p>
@@ -2723,7 +3309,23 @@
           <w:b/>
           <w:bCs/>
         </w:rPr>
-        <w:t>Database Layer:</w:t>
+        <w:t xml:space="preserve">Database </w:t>
+      </w:r>
+      <w:proofErr w:type="spellStart"/>
+      <w:r>
+        <w:rPr>
+          <w:b/>
+          <w:bCs/>
+        </w:rPr>
+        <w:t>Layer</w:t>
+      </w:r>
+      <w:proofErr w:type="spellEnd"/>
+      <w:r>
+        <w:rPr>
+          <w:b/>
+          <w:bCs/>
+        </w:rPr>
+        <w:t>:</w:t>
       </w:r>
       <w:r>
         <w:t xml:space="preserve"> Zorgt voor persistente opslag van statistische gegevens.</w:t>
@@ -2746,7 +3348,31 @@
     </w:p>
     <w:p>
       <w:r>
-        <w:t>Door live communicatie via WebSockets te combineren met een in-memory hour counter en periodieke opslag van geaggregeerde data, ontstaat een schaalbare en efficiënte architectuur. Real-time functionaliteit en statistische verwerking zijn duidelijk van elkaar gescheiden, wat bijdraagt aan performance, onderhoudbaarheid en overzichtelijkheid binnen het systeem.</w:t>
+        <w:t xml:space="preserve">Door live communicatie via </w:t>
+      </w:r>
+      <w:proofErr w:type="spellStart"/>
+      <w:r>
+        <w:t>WebSockets</w:t>
+      </w:r>
+      <w:proofErr w:type="spellEnd"/>
+      <w:r>
+        <w:t xml:space="preserve"> te combineren met een in-memory </w:t>
+      </w:r>
+      <w:proofErr w:type="spellStart"/>
+      <w:r>
+        <w:t>hour</w:t>
+      </w:r>
+      <w:proofErr w:type="spellEnd"/>
+      <w:r>
+        <w:t xml:space="preserve"> counter en periodieke opslag van geaggregeerde data, ontstaat een schaalbare en efficiënte architectuur. Real-time functionaliteit en statistische verwerking zijn duidelijk van elkaar gescheiden, wat bijdraagt aan performance, </w:t>
+      </w:r>
+      <w:proofErr w:type="spellStart"/>
+      <w:r>
+        <w:t>onderhoudbaarheid</w:t>
+      </w:r>
+      <w:proofErr w:type="spellEnd"/>
+      <w:r>
+        <w:t xml:space="preserve"> en overzichtelijkheid binnen het systeem.</w:t>
       </w:r>
     </w:p>
     <w:p/>
@@ -2864,17 +3490,52 @@
       <w:pPr>
         <w:pStyle w:val="Kop2"/>
       </w:pPr>
-      <w:r>
+    </w:p>
+    <w:p>
+      <w:pPr>
+        <w:pStyle w:val="Kop2"/>
+      </w:pPr>
+      <w:r>
+        <w:lastRenderedPageBreak/>
         <w:t>Overig</w:t>
       </w:r>
       <w:bookmarkEnd w:id="20"/>
     </w:p>
     <w:p>
       <w:r>
-        <w:lastRenderedPageBreak/>
         <w:t>Als er nog taken bij komen vanuit collega’s dan werk ik deze hier uit.</w:t>
       </w:r>
     </w:p>
+    <w:p>
+      <w:r>
+        <w:t xml:space="preserve">Ik ben erachter gekomen dat onze website extern wordt gehost en we dus zelf niet in het netwerk kunnen komen om de gemaakte prototype van de scan in de </w:t>
+      </w:r>
+      <w:proofErr w:type="spellStart"/>
+      <w:r>
+        <w:t>websocket</w:t>
+      </w:r>
+      <w:proofErr w:type="spellEnd"/>
+      <w:r>
+        <w:t xml:space="preserve"> te tonen op de website. Ik heb na aanleiding van dit probleem gebeld met 1 van de andere </w:t>
+      </w:r>
+      <w:proofErr w:type="spellStart"/>
+      <w:r>
+        <w:t>developers</w:t>
+      </w:r>
+      <w:proofErr w:type="spellEnd"/>
+      <w:r>
+        <w:t xml:space="preserve"> en voorgesteld om poorten te openen, maar dit was geen goed idee volgens die andere </w:t>
+      </w:r>
+      <w:proofErr w:type="spellStart"/>
+      <w:r>
+        <w:t>developer</w:t>
+      </w:r>
+      <w:proofErr w:type="spellEnd"/>
+      <w:r>
+        <w:t xml:space="preserve">. Samen hebben we bedacht dat ik een mail zou sturen naar het bedrijf waar de website gehost wordt om te vragen of het mogelijk is om de server voor onze website in een VPN of iets dergelijks te zetten, zodat we van buitenaf het netwerk van de website in kunnen. </w:t>
+      </w:r>
+    </w:p>
+    <w:p/>
     <w:p/>
     <w:sectPr>
       <w:headerReference w:type="even" r:id="rId14"/>
@@ -4058,6 +4719,7 @@
   <w:style w:type="character" w:default="1" w:styleId="Standaardalinea-lettertype">
     <w:name w:val="Default Paragraph Font"/>
     <w:uiPriority w:val="1"/>
+    <w:semiHidden/>
     <w:unhideWhenUsed/>
   </w:style>
   <w:style w:type="table" w:default="1" w:styleId="Standaardtabel">

</xml_diff>

<commit_message>
werkhyandleiding uitgerbeid met eerste uitwerkingen
</commit_message>
<xml_diff>
--- a/start_documents/Werkhandleiding stage.docx
+++ b/start_documents/Werkhandleiding stage.docx
@@ -1745,27 +1745,10 @@
           <w:b/>
           <w:bCs/>
         </w:rPr>
-        <w:t xml:space="preserve">5-layer </w:t>
-      </w:r>
-      <w:proofErr w:type="spellStart"/>
-      <w:r>
-        <w:rPr>
-          <w:b/>
-          <w:bCs/>
-        </w:rPr>
-        <w:t>architecture</w:t>
-      </w:r>
-      <w:proofErr w:type="spellEnd"/>
-      <w:r>
-        <w:t xml:space="preserve">, wat betekent dat de </w:t>
-      </w:r>
-      <w:proofErr w:type="spellStart"/>
-      <w:r>
-        <w:t>back-end</w:t>
-      </w:r>
-      <w:proofErr w:type="spellEnd"/>
-      <w:r>
-        <w:t xml:space="preserve"> wordt opgebouwd uit vijf duidelijk gescheiden lagen. Deze lagen zijn:</w:t>
+        <w:t>5-layer architecture</w:t>
+      </w:r>
+      <w:r>
+        <w:t>, wat betekent dat de back-end wordt opgebouwd uit vijf duidelijk gescheiden lagen. Deze lagen zijn:</w:t>
       </w:r>
     </w:p>
     <w:p>
@@ -1776,15 +1759,7 @@
         </w:numPr>
       </w:pPr>
       <w:r>
-        <w:t xml:space="preserve">Presentation </w:t>
-      </w:r>
-      <w:proofErr w:type="spellStart"/>
-      <w:r>
-        <w:t>layer</w:t>
-      </w:r>
-      <w:proofErr w:type="spellEnd"/>
-      <w:r>
-        <w:t xml:space="preserve"> (routing)</w:t>
+        <w:t>Presentation layer (routing)</w:t>
       </w:r>
     </w:p>
     <w:p>
@@ -1795,15 +1770,7 @@
         </w:numPr>
       </w:pPr>
       <w:r>
-        <w:t xml:space="preserve">Application </w:t>
-      </w:r>
-      <w:proofErr w:type="spellStart"/>
-      <w:r>
-        <w:t>layer</w:t>
-      </w:r>
-      <w:proofErr w:type="spellEnd"/>
-      <w:r>
-        <w:t xml:space="preserve"> (service)</w:t>
+        <w:t>Application layer (service)</w:t>
       </w:r>
     </w:p>
     <w:p>
@@ -1814,13 +1781,8 @@
         </w:numPr>
       </w:pPr>
       <w:r>
-        <w:t xml:space="preserve">Business logic </w:t>
-      </w:r>
-      <w:proofErr w:type="spellStart"/>
-      <w:r>
-        <w:t>layer</w:t>
-      </w:r>
-      <w:proofErr w:type="spellEnd"/>
+        <w:t>Business logic layer</w:t>
+      </w:r>
     </w:p>
     <w:p>
       <w:pPr>
@@ -1830,13 +1792,8 @@
         </w:numPr>
       </w:pPr>
       <w:r>
-        <w:t xml:space="preserve">Data access </w:t>
-      </w:r>
-      <w:proofErr w:type="spellStart"/>
-      <w:r>
-        <w:t>layer</w:t>
-      </w:r>
-      <w:proofErr w:type="spellEnd"/>
+        <w:t>Data access layer</w:t>
+      </w:r>
     </w:p>
     <w:p>
       <w:pPr>
@@ -1846,33 +1803,12 @@
         </w:numPr>
       </w:pPr>
       <w:r>
-        <w:t xml:space="preserve">Database </w:t>
-      </w:r>
-      <w:proofErr w:type="spellStart"/>
-      <w:r>
-        <w:t>layer</w:t>
-      </w:r>
-      <w:proofErr w:type="spellEnd"/>
-    </w:p>
-    <w:p>
-      <w:r>
-        <w:t xml:space="preserve">Deze architectuur bevordert de </w:t>
-      </w:r>
-      <w:proofErr w:type="spellStart"/>
-      <w:r>
-        <w:t>onderhoudbaarheid</w:t>
-      </w:r>
-      <w:proofErr w:type="spellEnd"/>
-      <w:r>
-        <w:t>, schaalbaarheid en testbaarheid van de applicatie. Doordat elke laag een eigen verantwoordelijkheid heeft (</w:t>
-      </w:r>
-      <w:proofErr w:type="spellStart"/>
-      <w:r>
-        <w:t>separation</w:t>
-      </w:r>
-      <w:proofErr w:type="spellEnd"/>
-      <w:r>
-        <w:t xml:space="preserve"> of concerns), blijft de code overzichtelijk en gestructureerd.</w:t>
+        <w:t>Database layer</w:t>
+      </w:r>
+    </w:p>
+    <w:p>
+      <w:r>
+        <w:t>Deze architectuur bevordert de onderhoudbaarheid, schaalbaarheid en testbaarheid van de applicatie. Doordat elke laag een eigen verantwoordelijkheid heeft (separation of concerns), blijft de code overzichtelijk en gestructureerd.</w:t>
       </w:r>
     </w:p>
     <w:p>
@@ -1887,15 +1823,7 @@
     </w:p>
     <w:p>
       <w:r>
-        <w:t xml:space="preserve">Tot slot vergemakkelijkt deze architectuur het testen van de applicatie. Omdat de lagen logisch zijn gescheiden, kunnen ze afzonderlijk worden getest (unit </w:t>
-      </w:r>
-      <w:proofErr w:type="spellStart"/>
-      <w:r>
-        <w:t>testing</w:t>
-      </w:r>
-      <w:proofErr w:type="spellEnd"/>
-      <w:r>
-        <w:t>), wat bijdraagt aan een hogere codekwaliteit en een veiligere, betrouwbaardere applicatie.</w:t>
+        <w:t>Tot slot vergemakkelijkt deze architectuur het testen van de applicatie. Omdat de lagen logisch zijn gescheiden, kunnen ze afzonderlijk worden getest (unit testing), wat bijdraagt aan een hogere codekwaliteit en een veiligere, betrouwbaardere applicatie.</w:t>
       </w:r>
     </w:p>
     <w:p/>
@@ -1924,11 +1852,9 @@
         <w:pStyle w:val="Kop2"/>
       </w:pPr>
       <w:bookmarkStart w:id="3" w:name="_Toc222393014"/>
-      <w:proofErr w:type="spellStart"/>
       <w:r>
         <w:t>Navbar</w:t>
       </w:r>
-      <w:proofErr w:type="spellEnd"/>
       <w:r>
         <w:t>.</w:t>
       </w:r>
@@ -1940,15 +1866,7 @@
       </w:pPr>
       <w:bookmarkStart w:id="4" w:name="_Toc222393015"/>
       <w:r>
-        <w:t xml:space="preserve">Hoe ziet de </w:t>
-      </w:r>
-      <w:proofErr w:type="spellStart"/>
-      <w:r>
-        <w:t>navbar</w:t>
-      </w:r>
-      <w:proofErr w:type="spellEnd"/>
-      <w:r>
-        <w:t xml:space="preserve"> er nu uit?</w:t>
+        <w:t>Hoe ziet de navbar er nu uit?</w:t>
       </w:r>
       <w:bookmarkEnd w:id="4"/>
     </w:p>
@@ -2120,15 +2038,7 @@
       <w:bookmarkStart w:id="7" w:name="_Toc222393018"/>
       <w:r>
         <w:lastRenderedPageBreak/>
-        <w:t>Smart-</w:t>
-      </w:r>
-      <w:proofErr w:type="spellStart"/>
-      <w:r>
-        <w:t>Iot</w:t>
-      </w:r>
-      <w:proofErr w:type="spellEnd"/>
-      <w:r>
-        <w:t>-Gateway-Scan moderniseren</w:t>
+        <w:t>Smart-Iot-Gateway-Scan moderniseren</w:t>
       </w:r>
       <w:bookmarkEnd w:id="7"/>
     </w:p>
@@ -2144,23 +2054,7 @@
     </w:p>
     <w:p>
       <w:r>
-        <w:t>Op dit moment is de Smart-</w:t>
-      </w:r>
-      <w:proofErr w:type="spellStart"/>
-      <w:r>
-        <w:t>IoT</w:t>
-      </w:r>
-      <w:proofErr w:type="spellEnd"/>
-      <w:r>
-        <w:t xml:space="preserve">-Gateway-Scan een stream die vanaf </w:t>
-      </w:r>
-      <w:proofErr w:type="spellStart"/>
-      <w:r>
-        <w:t>twitch</w:t>
-      </w:r>
-      <w:proofErr w:type="spellEnd"/>
-      <w:r>
-        <w:t xml:space="preserve"> wordt gestreamd op de website.</w:t>
+        <w:t>Op dit moment is de Smart-IoT-Gateway-Scan een stream die vanaf twitch wordt gestreamd op de website.</w:t>
       </w:r>
     </w:p>
     <w:p>
@@ -2175,15 +2069,7 @@
     </w:p>
     <w:p>
       <w:r>
-        <w:t xml:space="preserve">Ik wil een moderne versie maken van deze scan. Ik wil het zo maken dat ik compleet van </w:t>
-      </w:r>
-      <w:proofErr w:type="spellStart"/>
-      <w:r>
-        <w:t>Twitch</w:t>
-      </w:r>
-      <w:proofErr w:type="spellEnd"/>
-      <w:r>
-        <w:t xml:space="preserve"> als tussen persoon af ben. Dit betekend dat ik de data uit een API wil halen en deze rechtstreeks tonen op de homepagina. Documentatie over de backend API staat verderop en deze handleiding en is te vinden in de inhoudsopgave.</w:t>
+        <w:t>Ik wil een moderne versie maken van deze scan. Ik wil het zo maken dat ik compleet van Twitch als tussen persoon af ben. Dit betekend dat ik de data uit een API wil halen en deze rechtstreeks tonen op de homepagina. Documentatie over de backend API staat verderop en deze handleiding en is te vinden in de inhoudsopgave.</w:t>
       </w:r>
     </w:p>
     <w:p>
@@ -2198,31 +2084,7 @@
     </w:p>
     <w:p>
       <w:r>
-        <w:t xml:space="preserve">Ik wil (indien mogelijk) in de rootfolder (homefolder) van de </w:t>
-      </w:r>
-      <w:proofErr w:type="spellStart"/>
-      <w:r>
-        <w:t>frontend</w:t>
-      </w:r>
-      <w:proofErr w:type="spellEnd"/>
-      <w:r>
-        <w:t xml:space="preserve"> een </w:t>
-      </w:r>
-      <w:proofErr w:type="spellStart"/>
-      <w:r>
-        <w:t>config.env</w:t>
-      </w:r>
-      <w:proofErr w:type="spellEnd"/>
-      <w:r>
-        <w:t xml:space="preserve"> aanmaken waarin ik een gebruikersnaam en wachtwoord zet welke worden meegestuurd met elke </w:t>
-      </w:r>
-      <w:proofErr w:type="spellStart"/>
-      <w:r>
-        <w:t>request</w:t>
-      </w:r>
-      <w:proofErr w:type="spellEnd"/>
-      <w:r>
-        <w:t xml:space="preserve"> naar de API.</w:t>
+        <w:t>Ik wil (indien mogelijk) in de rootfolder (homefolder) van de frontend een config.env aanmaken waarin ik een gebruikersnaam en wachtwoord zet welke worden meegestuurd met elke request naar de API.</w:t>
       </w:r>
     </w:p>
     <w:p>
@@ -2230,13 +2092,8 @@
         <w:pStyle w:val="Kop3"/>
       </w:pPr>
       <w:bookmarkStart w:id="11" w:name="_Toc222393022"/>
-      <w:proofErr w:type="spellStart"/>
-      <w:r>
-        <w:t>Sequence</w:t>
-      </w:r>
-      <w:proofErr w:type="spellEnd"/>
-      <w:r>
-        <w:t xml:space="preserve"> diagram</w:t>
+      <w:r>
+        <w:t>Sequence diagram</w:t>
       </w:r>
       <w:bookmarkEnd w:id="11"/>
       <w:r>
@@ -2313,45 +2170,13 @@
       <w:bookmarkStart w:id="12" w:name="_Toc222393023"/>
       <w:r>
         <w:lastRenderedPageBreak/>
-        <w:t>Grafiek Smart-</w:t>
-      </w:r>
-      <w:proofErr w:type="spellStart"/>
-      <w:r>
-        <w:t>IoT</w:t>
-      </w:r>
-      <w:proofErr w:type="spellEnd"/>
-      <w:r>
-        <w:t>-Gateway-Scan</w:t>
+        <w:t>Grafiek Smart-IoT-Gateway-Scan</w:t>
       </w:r>
       <w:bookmarkEnd w:id="12"/>
     </w:p>
     <w:p>
       <w:r>
-        <w:t>De Smart-</w:t>
-      </w:r>
-      <w:proofErr w:type="spellStart"/>
-      <w:r>
-        <w:t>IoT</w:t>
-      </w:r>
-      <w:proofErr w:type="spellEnd"/>
-      <w:r>
-        <w:t xml:space="preserve">-Gateway-Scan wil ik uit een API laten zien, maar ik wil hem ook een grafiek laten zien van deze scan vanuit een API. Deze API stuurt ieder uur een </w:t>
-      </w:r>
-      <w:proofErr w:type="spellStart"/>
-      <w:r>
-        <w:t>request</w:t>
-      </w:r>
-      <w:proofErr w:type="spellEnd"/>
-      <w:r>
-        <w:t xml:space="preserve"> naar de </w:t>
-      </w:r>
-      <w:proofErr w:type="spellStart"/>
-      <w:r>
-        <w:t>back-end</w:t>
-      </w:r>
-      <w:proofErr w:type="spellEnd"/>
-      <w:r>
-        <w:t xml:space="preserve"> en deze krijgt 1 nummer terug en dit zijn het aantal apparaten dat gescand zijn in dat afgelopen uur. </w:t>
+        <w:t xml:space="preserve">De Smart-IoT-Gateway-Scan wil ik uit een API laten zien, maar ik wil hem ook een grafiek laten zien van deze scan vanuit een API. Deze API stuurt ieder uur een request naar de back-end en deze krijgt 1 nummer terug en dit zijn het aantal apparaten dat gescand zijn in dat afgelopen uur. </w:t>
       </w:r>
     </w:p>
     <w:p>
@@ -2360,50 +2185,13 @@
       </w:pPr>
       <w:bookmarkStart w:id="13" w:name="_Toc222393024"/>
       <w:r>
-        <w:t xml:space="preserve">Framework en </w:t>
-      </w:r>
-      <w:proofErr w:type="spellStart"/>
-      <w:r>
-        <w:t>libraries</w:t>
+        <w:t>Framework en libraries</w:t>
       </w:r>
       <w:bookmarkEnd w:id="13"/>
-      <w:proofErr w:type="spellEnd"/>
-    </w:p>
-    <w:p>
-      <w:r>
-        <w:t xml:space="preserve">Ik wil deze grafiek realiseren met python en met de </w:t>
-      </w:r>
-      <w:proofErr w:type="spellStart"/>
-      <w:r>
-        <w:t>library</w:t>
-      </w:r>
-      <w:proofErr w:type="spellEnd"/>
-      <w:r>
-        <w:t xml:space="preserve"> </w:t>
-      </w:r>
-      <w:proofErr w:type="spellStart"/>
-      <w:r>
-        <w:t>Matploblib</w:t>
-      </w:r>
-      <w:proofErr w:type="spellEnd"/>
-      <w:r>
-        <w:t xml:space="preserve">, echter weet ik niet wat er op dit moment wordt gebruikt voor codetaal of eventuele </w:t>
-      </w:r>
-      <w:proofErr w:type="spellStart"/>
-      <w:r>
-        <w:t>frameworks</w:t>
-      </w:r>
-      <w:proofErr w:type="spellEnd"/>
-      <w:r>
-        <w:t xml:space="preserve"> binnen het bedrijf. Als ik dat zeker weet kan ik pas met zekerheid zeggen welke </w:t>
-      </w:r>
-      <w:proofErr w:type="spellStart"/>
-      <w:r>
-        <w:t>library</w:t>
-      </w:r>
-      <w:proofErr w:type="spellEnd"/>
-      <w:r>
-        <w:t xml:space="preserve"> ik hiervoor kan gebruiken.</w:t>
+    </w:p>
+    <w:p>
+      <w:r>
+        <w:t>Ik wil deze grafiek realiseren met python en met de library Matploblib, echter weet ik niet wat er op dit moment wordt gebruikt voor codetaal of eventuele frameworks binnen het bedrijf. Als ik dat zeker weet kan ik pas met zekerheid zeggen welke library ik hiervoor kan gebruiken.</w:t>
       </w:r>
     </w:p>
     <w:p>
@@ -2418,36 +2206,15 @@
     </w:p>
     <w:p>
       <w:r>
-        <w:t xml:space="preserve">Net zoals in de vorige vraagstelling wil ik in de rootfolder (homefolder) een </w:t>
-      </w:r>
-      <w:proofErr w:type="spellStart"/>
-      <w:r>
-        <w:t>config.env</w:t>
-      </w:r>
-      <w:proofErr w:type="spellEnd"/>
-      <w:r>
-        <w:t xml:space="preserve"> fil e maken waarin een gebruikersnaam en wachtwoord staan die mee wordt gestuurd in de get </w:t>
-      </w:r>
-      <w:proofErr w:type="spellStart"/>
-      <w:r>
-        <w:t>request</w:t>
-      </w:r>
-      <w:proofErr w:type="spellEnd"/>
-      <w:r>
-        <w:t xml:space="preserve"> naar de backend.</w:t>
+        <w:t>Net zoals in de vorige vraagstelling wil ik in de rootfolder (homefolder) een config.env fil e maken waarin een gebruikersnaam en wachtwoord staan die mee wordt gestuurd in de get request naar de backend.</w:t>
       </w:r>
     </w:p>
     <w:p>
       <w:pPr>
         <w:pStyle w:val="Kop3"/>
       </w:pPr>
-      <w:proofErr w:type="spellStart"/>
-      <w:r>
-        <w:t>Sequence</w:t>
-      </w:r>
-      <w:proofErr w:type="spellEnd"/>
-      <w:r>
-        <w:t xml:space="preserve"> diagram</w:t>
+      <w:r>
+        <w:t>Sequence diagram</w:t>
       </w:r>
     </w:p>
     <w:p>
@@ -2531,37 +2298,13 @@
       </w:pPr>
       <w:bookmarkStart w:id="16" w:name="_Toc222393027"/>
       <w:r>
-        <w:t>Smart-</w:t>
-      </w:r>
-      <w:proofErr w:type="spellStart"/>
-      <w:r>
-        <w:t>IoT</w:t>
-      </w:r>
-      <w:proofErr w:type="spellEnd"/>
-      <w:r>
-        <w:t>-Gateway-Scan halen uit een API</w:t>
+        <w:t>Smart-IoT-Gateway-Scan halen uit een API</w:t>
       </w:r>
       <w:bookmarkEnd w:id="16"/>
     </w:p>
     <w:p>
       <w:r>
-        <w:t>Zoals eerder vernoemd wil ik de Smart-</w:t>
-      </w:r>
-      <w:proofErr w:type="spellStart"/>
-      <w:r>
-        <w:t>IoT</w:t>
-      </w:r>
-      <w:proofErr w:type="spellEnd"/>
-      <w:r>
-        <w:t xml:space="preserve">-Gateway-Scan uit een API gaan halen, zodat deze via een sectie op de website gezien kan laten worden op de homepage van de website I.P.V een livestream vanuit </w:t>
-      </w:r>
-      <w:proofErr w:type="spellStart"/>
-      <w:r>
-        <w:t>Twitch</w:t>
-      </w:r>
-      <w:proofErr w:type="spellEnd"/>
-      <w:r>
-        <w:t>.</w:t>
+        <w:t>Zoals eerder vernoemd wil ik de Smart-IoT-Gateway-Scan uit een API gaan halen, zodat deze via een sectie op de website gezien kan laten worden op de homepage van de website I.P.V een livestream vanuit Twitch.</w:t>
       </w:r>
       <w:r>
         <w:br/>
@@ -2577,23 +2320,7 @@
     </w:p>
     <w:p>
       <w:r>
-        <w:t xml:space="preserve">De </w:t>
-      </w:r>
-      <w:proofErr w:type="spellStart"/>
-      <w:r>
-        <w:t>API’s</w:t>
-      </w:r>
-      <w:proofErr w:type="spellEnd"/>
-      <w:r>
-        <w:t xml:space="preserve"> die ik ga ontwikkelen binnen mijn stageperiode ga ik maken met Python in het ‘Django’ </w:t>
-      </w:r>
-      <w:proofErr w:type="spellStart"/>
-      <w:r>
-        <w:t>framework</w:t>
-      </w:r>
-      <w:proofErr w:type="spellEnd"/>
-      <w:r>
-        <w:t>.</w:t>
+        <w:t>De API’s die ik ga ontwikkelen binnen mijn stageperiode ga ik maken met Python in het ‘Django’ framework.</w:t>
       </w:r>
     </w:p>
     <w:p>
@@ -2616,29 +2343,11 @@
       <w:r>
         <w:t xml:space="preserve"> zitten bij een API die op een live pagina wordt gebruikt. Om dit zo veilig mogelijk te maken wil ik in de rootfolder (homefolder) voor de </w:t>
       </w:r>
-      <w:proofErr w:type="spellStart"/>
       <w:r>
         <w:t>Api’s</w:t>
       </w:r>
-      <w:proofErr w:type="spellEnd"/>
-      <w:r>
-        <w:t xml:space="preserve"> een </w:t>
-      </w:r>
-      <w:proofErr w:type="spellStart"/>
-      <w:r>
-        <w:t>config.env</w:t>
-      </w:r>
-      <w:proofErr w:type="spellEnd"/>
-      <w:r>
-        <w:t xml:space="preserve"> plaatsen. Hierin wil ik natuurlijk een gebruikersnaam en een wachtwoord plaatsen voor de database, maar ook een gebruikersnaam en wachtwoord die ik verwacht in een </w:t>
-      </w:r>
-      <w:proofErr w:type="spellStart"/>
-      <w:r>
-        <w:t>request</w:t>
-      </w:r>
-      <w:proofErr w:type="spellEnd"/>
-      <w:r>
-        <w:t xml:space="preserve"> header vanuit de </w:t>
+      <w:r>
+        <w:t xml:space="preserve"> een config.env plaatsen. Hierin wil ik natuurlijk een gebruikersnaam en een wachtwoord plaatsen voor de database, maar ook een gebruikersnaam en wachtwoord die ik verwacht in een request header vanuit de </w:t>
       </w:r>
       <w:r>
         <w:t>front-end</w:t>
@@ -2667,15 +2376,7 @@
       <w:bookmarkStart w:id="18" w:name="_Toc222393029"/>
       <w:r>
         <w:lastRenderedPageBreak/>
-        <w:t>Grafiek maken van Smart-</w:t>
-      </w:r>
-      <w:proofErr w:type="spellStart"/>
-      <w:r>
-        <w:t>IoT</w:t>
-      </w:r>
-      <w:proofErr w:type="spellEnd"/>
-      <w:r>
-        <w:t>-Gateway-Scan</w:t>
+        <w:t>Grafiek maken van Smart-IoT-Gateway-Scan</w:t>
       </w:r>
       <w:bookmarkEnd w:id="18"/>
     </w:p>
@@ -2705,39 +2406,9 @@
     </w:p>
     <w:p>
       <w:r>
-        <w:t xml:space="preserve">Ook dit wil ik op een zelfde manier aanpakken als de bovenstaande vraag </w:t>
-      </w:r>
-      <w:proofErr w:type="spellStart"/>
-      <w:r>
-        <w:t>kwa</w:t>
-      </w:r>
-      <w:proofErr w:type="spellEnd"/>
-      <w:r>
-        <w:t xml:space="preserve"> security. Ook hier wil ik in een </w:t>
-      </w:r>
-      <w:proofErr w:type="spellStart"/>
-      <w:r>
-        <w:t>config.env</w:t>
-      </w:r>
-      <w:proofErr w:type="spellEnd"/>
-      <w:r>
-        <w:t xml:space="preserve"> bestand zetten </w:t>
-      </w:r>
-      <w:proofErr w:type="spellStart"/>
-      <w:r>
-        <w:t>wellke</w:t>
-      </w:r>
-      <w:proofErr w:type="spellEnd"/>
-      <w:r>
-        <w:t xml:space="preserve"> gebruikersnaam en welk wachtwoord er moeten worden opgevraagd in de front-end.</w:t>
-      </w:r>
-    </w:p>
-    <w:p/>
-    <w:p/>
-    <w:p/>
-    <w:p/>
-    <w:p/>
-    <w:p/>
+        <w:t>Ook dit wil ik op een zelfde manier aanpakken als de bovenstaande vraag kwa security. Ook hier wil ik in een config.env bestand zetten wellke gebruikersnaam en welk wachtwoord er moeten worden opgevraagd in de front-end.</w:t>
+      </w:r>
+    </w:p>
     <w:p/>
     <w:p/>
     <w:p/>
@@ -2817,30 +2488,11 @@
         </w:drawing>
       </w:r>
     </w:p>
-    <w:p/>
-    <w:p/>
-    <w:p/>
-    <w:p/>
-    <w:p/>
-    <w:p/>
-    <w:p/>
-    <w:p/>
-    <w:p/>
-    <w:p/>
-    <w:p/>
-    <w:p/>
-    <w:p/>
-    <w:p/>
-    <w:p/>
-    <w:p/>
-    <w:p/>
-    <w:p/>
     <w:p>
       <w:pPr>
         <w:pStyle w:val="Kop3"/>
       </w:pPr>
       <w:r>
-        <w:lastRenderedPageBreak/>
         <w:t>Uitleg</w:t>
       </w:r>
     </w:p>
@@ -2856,52 +2508,48 @@
           <w:b/>
           <w:bCs/>
         </w:rPr>
-        <w:t>Technische uitwerking van de live Smart-</w:t>
-      </w:r>
-      <w:proofErr w:type="spellStart"/>
-      <w:r>
+        <w:t>Technische uitwerking van de live Smart-IoT-Gateway-Scan</w:t>
+      </w:r>
+    </w:p>
+    <w:p>
+      <w:r>
+        <w:t>Het systeem voor de Smart-IoT-Gateway-Scan is opgebouwd volgens een 5-layer architecture en bestaat uit twee parallelle processen: een live weergave van gescande Bluetooth-apparaten en een uuraggregatie voor statistische opslag. Door deze processen van elkaar te scheiden wordt zowel real-time functionaliteit als efficiënte dataopslag gerealiseerd.</w:t>
+      </w:r>
+    </w:p>
+    <w:p>
+      <w:pPr>
         <w:rPr>
           <w:b/>
           <w:bCs/>
         </w:rPr>
-        <w:t>IoT</w:t>
-      </w:r>
-      <w:proofErr w:type="spellEnd"/>
+      </w:pPr>
       <w:r>
         <w:rPr>
           <w:b/>
           <w:bCs/>
         </w:rPr>
-        <w:t>-Gateway-Scan</w:t>
-      </w:r>
-    </w:p>
-    <w:p>
-      <w:r>
-        <w:t>Het systeem voor de Smart-</w:t>
-      </w:r>
-      <w:proofErr w:type="spellStart"/>
-      <w:r>
-        <w:t>IoT</w:t>
-      </w:r>
-      <w:proofErr w:type="spellEnd"/>
-      <w:r>
-        <w:t xml:space="preserve">-Gateway-Scan is opgebouwd volgens een 5-layer </w:t>
-      </w:r>
-      <w:proofErr w:type="spellStart"/>
-      <w:r>
-        <w:t>architecture</w:t>
-      </w:r>
-      <w:proofErr w:type="spellEnd"/>
-      <w:r>
-        <w:t xml:space="preserve"> en bestaat uit twee parallelle processen: een live weergave van gescande Bluetooth-apparaten en een </w:t>
-      </w:r>
-      <w:proofErr w:type="spellStart"/>
-      <w:r>
-        <w:t>uuraggregatie</w:t>
-      </w:r>
-      <w:proofErr w:type="spellEnd"/>
-      <w:r>
-        <w:t xml:space="preserve"> voor statistische opslag. Door deze processen van elkaar te scheiden wordt zowel real-time functionaliteit als efficiënte dataopslag gerealiseerd.</w:t>
+        <w:t>Live weergave via WebSocket</w:t>
+      </w:r>
+    </w:p>
+    <w:p>
+      <w:r>
+        <w:t>Wanneer een gebruiker de homepage opent, wordt een WebSocket-verbinding opgezet tussen de frontend en de backend. Tijdens het tot stand brengen van deze verbinding vindt authenticatie plaats. Na succesvolle validatie blijft de verbinding actief als een persistent, bidirectioneel communicatiekanaal.</w:t>
+      </w:r>
+    </w:p>
+    <w:p>
+      <w:r>
+        <w:t>Wanneer het Bluetooth-scanproces (uitgevoerd via CMD) een nieuw apparaat detecteert, wordt dit scan-event doorgestuurd naar de backend. De Application Layer ontvangt dit event en stuurt het door naar de Business Logic Layer. Binnen deze laag wordt het scan-event gevalideerd, bijvoorbeeld door controle op duplicaten of ongeldige data.</w:t>
+      </w:r>
+    </w:p>
+    <w:p>
+      <w:r>
+        <w:t>Na succesvolle validatie wordt een in-memory teller verhoogd. Vervolgens wordt het scan-event via de Presentation Layer direct doorgestuurd naar alle actieve WebSocket-clients. Hierdoor wordt het gescande apparaat real-time weergegeven op de homepage, zonder dat de pagina opnieuw geladen hoeft te worden.</w:t>
+      </w:r>
+    </w:p>
+    <w:p>
+      <w:r>
+        <w:lastRenderedPageBreak/>
+        <w:t>Belangrijk hierbij is dat individuele scan-events niet in de database worden opgeslagen. De live communicatie verloopt volledig via WebSocket, waardoor de database niet wordt belast met grote hoeveelheden real-time data.</w:t>
       </w:r>
     </w:p>
     <w:p>
@@ -2916,416 +2564,129 @@
           <w:b/>
           <w:bCs/>
         </w:rPr>
-        <w:t xml:space="preserve">Live weergave via </w:t>
-      </w:r>
-      <w:proofErr w:type="spellStart"/>
-      <w:r>
+        <w:t>Hourly counter en statistische opslag</w:t>
+      </w:r>
+    </w:p>
+    <w:p>
+      <w:r>
+        <w:t>Naast de live weergave houdt het systeem een in-memory teller bij die het aantal gescande apparaten binnen een uur registreert. Elke geldige scan verhoogt deze teller met één. Tijdens dit proces vindt geen database-interactie plaats.</w:t>
+      </w:r>
+    </w:p>
+    <w:p>
+      <w:r>
+        <w:t>Aan het einde van ieder uur wordt door middel van een scheduler een opslagproces geactiveerd. De Application Layer vraagt de Business Logic Layer om de huidige tellerwaarde op te halen. Vervolgens wordt de teller gereset naar nul voor het nieuwe uur.</w:t>
+      </w:r>
+    </w:p>
+    <w:p>
+      <w:r>
+        <w:t>De Data Access Layer slaat uitsluitend het uurtotaal op in de database. De database bevat dus enkel geaggregeerde gegevens (uurtotalen) en geen individuele scan-events. Deze opgeslagen totalen worden later gebruikt voor het genereren van statistieken en grafieken, bijvoorbeeld met behulp van een visualisatiebibliotheek zoals Matplotlib.</w:t>
+      </w:r>
+    </w:p>
+    <w:p>
+      <w:pPr>
         <w:rPr>
           <w:b/>
           <w:bCs/>
         </w:rPr>
-        <w:t>WebSocket</w:t>
-      </w:r>
-      <w:proofErr w:type="spellEnd"/>
-    </w:p>
-    <w:p>
-      <w:r>
-        <w:t xml:space="preserve">Wanneer een gebruiker de homepage opent, wordt een </w:t>
-      </w:r>
-      <w:proofErr w:type="spellStart"/>
-      <w:r>
-        <w:t>WebSocket</w:t>
-      </w:r>
-      <w:proofErr w:type="spellEnd"/>
-      <w:r>
-        <w:t xml:space="preserve">-verbinding opgezet tussen de </w:t>
-      </w:r>
-      <w:proofErr w:type="spellStart"/>
-      <w:r>
-        <w:t>frontend</w:t>
-      </w:r>
-      <w:proofErr w:type="spellEnd"/>
-      <w:r>
-        <w:t xml:space="preserve"> en de backend. Tijdens het tot stand brengen van deze verbinding vindt authenticatie plaats. Na succesvolle validatie blijft de verbinding actief als een persistent, </w:t>
-      </w:r>
-      <w:proofErr w:type="spellStart"/>
-      <w:r>
-        <w:t>bidirectioneel</w:t>
-      </w:r>
-      <w:proofErr w:type="spellEnd"/>
-      <w:r>
-        <w:t xml:space="preserve"> communicatiekanaal.</w:t>
-      </w:r>
-    </w:p>
-    <w:p>
-      <w:r>
-        <w:t xml:space="preserve">Wanneer het Bluetooth-scanproces (uitgevoerd via CMD) een nieuw apparaat detecteert, wordt dit scan-event doorgestuurd naar de backend. De Application </w:t>
-      </w:r>
-      <w:proofErr w:type="spellStart"/>
-      <w:r>
-        <w:t>Layer</w:t>
-      </w:r>
-      <w:proofErr w:type="spellEnd"/>
-      <w:r>
-        <w:t xml:space="preserve"> ontvangt dit event en stuurt het door naar de Business Logic </w:t>
-      </w:r>
-      <w:proofErr w:type="spellStart"/>
-      <w:r>
-        <w:t>Layer</w:t>
-      </w:r>
-      <w:proofErr w:type="spellEnd"/>
-      <w:r>
-        <w:t>. Binnen deze laag wordt het scan-event gevalideerd, bijvoorbeeld door controle op duplicaten of ongeldige data.</w:t>
-      </w:r>
-    </w:p>
-    <w:p>
-      <w:r>
-        <w:t xml:space="preserve">Na succesvolle validatie wordt een in-memory teller verhoogd. Vervolgens wordt het scan-event via de Presentation </w:t>
-      </w:r>
-      <w:proofErr w:type="spellStart"/>
-      <w:r>
-        <w:t>Layer</w:t>
-      </w:r>
-      <w:proofErr w:type="spellEnd"/>
-      <w:r>
-        <w:t xml:space="preserve"> direct doorgestuurd naar alle actieve </w:t>
-      </w:r>
-      <w:proofErr w:type="spellStart"/>
-      <w:r>
-        <w:t>WebSocket</w:t>
-      </w:r>
-      <w:proofErr w:type="spellEnd"/>
-      <w:r>
-        <w:t>-clients. Hierdoor wordt het gescande apparaat real-time weergegeven op de homepage, zonder dat de pagina opnieuw geladen hoeft te worden.</w:t>
-      </w:r>
-    </w:p>
-    <w:p>
-      <w:r>
-        <w:t xml:space="preserve">Belangrijk hierbij is dat individuele scan-events niet in de database worden opgeslagen. De live communicatie verloopt volledig via </w:t>
-      </w:r>
-      <w:proofErr w:type="spellStart"/>
-      <w:r>
-        <w:t>WebSocket</w:t>
-      </w:r>
-      <w:proofErr w:type="spellEnd"/>
-      <w:r>
-        <w:t>, waardoor de database niet wordt belast met grote hoeveelheden real-time data.</w:t>
-      </w:r>
-    </w:p>
-    <w:p>
-      <w:pPr>
+      </w:pPr>
+      <w:r>
         <w:rPr>
           <w:b/>
           <w:bCs/>
         </w:rPr>
-      </w:pPr>
-      <w:proofErr w:type="spellStart"/>
+        <w:t>Verdeling binnen de 5-layer architecture</w:t>
+      </w:r>
+    </w:p>
+    <w:p>
+      <w:r>
+        <w:t>De verantwoordelijkheden zijn als volgt verdeeld:</w:t>
+      </w:r>
+    </w:p>
+    <w:p>
+      <w:pPr>
+        <w:numPr>
+          <w:ilvl w:val="0"/>
+          <w:numId w:val="3"/>
+        </w:numPr>
+      </w:pPr>
       <w:r>
         <w:rPr>
           <w:b/>
           <w:bCs/>
         </w:rPr>
-        <w:t>Hourly</w:t>
-      </w:r>
-      <w:proofErr w:type="spellEnd"/>
+        <w:t>Presentation Layer:</w:t>
+      </w:r>
+      <w:r>
+        <w:t xml:space="preserve"> Beheert de WebSocket-verbinding en verzorgt het verzenden van live updates naar clients.</w:t>
+      </w:r>
+    </w:p>
+    <w:p>
+      <w:pPr>
+        <w:numPr>
+          <w:ilvl w:val="0"/>
+          <w:numId w:val="3"/>
+        </w:numPr>
+      </w:pPr>
       <w:r>
         <w:rPr>
           <w:b/>
           <w:bCs/>
         </w:rPr>
-        <w:t xml:space="preserve"> counter en statistische opslag</w:t>
-      </w:r>
-    </w:p>
-    <w:p>
-      <w:r>
-        <w:t>Naast de live weergave houdt het systeem een in-memory teller bij die het aantal gescande apparaten binnen een uur registreert. Elke geldige scan verhoogt deze teller met één. Tijdens dit proces vindt geen database-interactie plaats.</w:t>
-      </w:r>
-    </w:p>
-    <w:p>
-      <w:r>
-        <w:t xml:space="preserve">Aan het einde van ieder uur wordt door middel van een </w:t>
-      </w:r>
-      <w:proofErr w:type="spellStart"/>
-      <w:r>
-        <w:t>scheduler</w:t>
-      </w:r>
-      <w:proofErr w:type="spellEnd"/>
-      <w:r>
-        <w:t xml:space="preserve"> een opslagproces geactiveerd. De Application </w:t>
-      </w:r>
-      <w:proofErr w:type="spellStart"/>
-      <w:r>
-        <w:t>Layer</w:t>
-      </w:r>
-      <w:proofErr w:type="spellEnd"/>
-      <w:r>
-        <w:t xml:space="preserve"> vraagt de Business Logic </w:t>
-      </w:r>
-      <w:proofErr w:type="spellStart"/>
-      <w:r>
-        <w:t>Layer</w:t>
-      </w:r>
-      <w:proofErr w:type="spellEnd"/>
-      <w:r>
-        <w:t xml:space="preserve"> om de huidige </w:t>
-      </w:r>
-      <w:proofErr w:type="spellStart"/>
-      <w:r>
-        <w:t>tellerwaarde</w:t>
-      </w:r>
-      <w:proofErr w:type="spellEnd"/>
-      <w:r>
-        <w:t xml:space="preserve"> op te halen. Vervolgens wordt de teller gereset naar nul voor het nieuwe uur.</w:t>
-      </w:r>
-    </w:p>
-    <w:p>
-      <w:r>
-        <w:t xml:space="preserve">De Data Access </w:t>
-      </w:r>
-      <w:proofErr w:type="spellStart"/>
-      <w:r>
-        <w:t>Layer</w:t>
-      </w:r>
-      <w:proofErr w:type="spellEnd"/>
-      <w:r>
-        <w:t xml:space="preserve"> slaat uitsluitend het </w:t>
-      </w:r>
-      <w:proofErr w:type="spellStart"/>
-      <w:r>
-        <w:t>uurtotaal</w:t>
-      </w:r>
-      <w:proofErr w:type="spellEnd"/>
-      <w:r>
-        <w:t xml:space="preserve"> op in de database. De database bevat dus enkel geaggregeerde gegevens (</w:t>
-      </w:r>
-      <w:proofErr w:type="spellStart"/>
-      <w:r>
-        <w:t>uurtotalen</w:t>
-      </w:r>
-      <w:proofErr w:type="spellEnd"/>
-      <w:r>
-        <w:t>) en geen individuele scan-events. Deze opgeslagen totalen worden later gebruikt voor het genereren van statistieken en grafieken, bijvoorbeeld met behulp van een visualisatiebibliotheek zoals Matplotlib.</w:t>
-      </w:r>
-    </w:p>
-    <w:p>
-      <w:pPr>
+        <w:t>Application Layer:</w:t>
+      </w:r>
+      <w:r>
+        <w:t xml:space="preserve"> Orkestreert scan-events en coördineert het uur-opslagproces.</w:t>
+      </w:r>
+    </w:p>
+    <w:p>
+      <w:pPr>
+        <w:numPr>
+          <w:ilvl w:val="0"/>
+          <w:numId w:val="3"/>
+        </w:numPr>
+      </w:pPr>
+      <w:r>
         <w:rPr>
           <w:b/>
           <w:bCs/>
         </w:rPr>
+        <w:t>Business Logic Layer:</w:t>
+      </w:r>
+      <w:r>
+        <w:t xml:space="preserve"> Valideert scan-events en beheert de in-memory hour counter.</w:t>
+      </w:r>
+    </w:p>
+    <w:p>
+      <w:pPr>
+        <w:numPr>
+          <w:ilvl w:val="0"/>
+          <w:numId w:val="3"/>
+        </w:numPr>
       </w:pPr>
       <w:r>
         <w:rPr>
           <w:b/>
           <w:bCs/>
         </w:rPr>
-        <w:lastRenderedPageBreak/>
-        <w:t xml:space="preserve">Verdeling binnen de 5-layer </w:t>
-      </w:r>
-      <w:proofErr w:type="spellStart"/>
+        <w:t>Data Access Layer:</w:t>
+      </w:r>
+      <w:r>
+        <w:t xml:space="preserve"> Verzorgt de opslag van uurtotalen in de database.</w:t>
+      </w:r>
+    </w:p>
+    <w:p>
+      <w:pPr>
+        <w:numPr>
+          <w:ilvl w:val="0"/>
+          <w:numId w:val="3"/>
+        </w:numPr>
+      </w:pPr>
       <w:r>
         <w:rPr>
           <w:b/>
           <w:bCs/>
         </w:rPr>
-        <w:t>architecture</w:t>
-      </w:r>
-      <w:proofErr w:type="spellEnd"/>
-    </w:p>
-    <w:p>
-      <w:r>
-        <w:t>De verantwoordelijkheden zijn als volgt verdeeld:</w:t>
-      </w:r>
-    </w:p>
-    <w:p>
-      <w:pPr>
-        <w:numPr>
-          <w:ilvl w:val="0"/>
-          <w:numId w:val="3"/>
-        </w:numPr>
-      </w:pPr>
-      <w:r>
-        <w:rPr>
-          <w:b/>
-          <w:bCs/>
-        </w:rPr>
-        <w:t xml:space="preserve">Presentation </w:t>
-      </w:r>
-      <w:proofErr w:type="spellStart"/>
-      <w:r>
-        <w:rPr>
-          <w:b/>
-          <w:bCs/>
-        </w:rPr>
-        <w:t>Layer</w:t>
-      </w:r>
-      <w:proofErr w:type="spellEnd"/>
-      <w:r>
-        <w:rPr>
-          <w:b/>
-          <w:bCs/>
-        </w:rPr>
-        <w:t>:</w:t>
-      </w:r>
-      <w:r>
-        <w:t xml:space="preserve"> Beheert de </w:t>
-      </w:r>
-      <w:proofErr w:type="spellStart"/>
-      <w:r>
-        <w:t>WebSocket</w:t>
-      </w:r>
-      <w:proofErr w:type="spellEnd"/>
-      <w:r>
-        <w:t>-verbinding en verzorgt het verzenden van live updates naar clients.</w:t>
-      </w:r>
-    </w:p>
-    <w:p>
-      <w:pPr>
-        <w:numPr>
-          <w:ilvl w:val="0"/>
-          <w:numId w:val="3"/>
-        </w:numPr>
-      </w:pPr>
-      <w:r>
-        <w:rPr>
-          <w:b/>
-          <w:bCs/>
-        </w:rPr>
-        <w:t xml:space="preserve">Application </w:t>
-      </w:r>
-      <w:proofErr w:type="spellStart"/>
-      <w:r>
-        <w:rPr>
-          <w:b/>
-          <w:bCs/>
-        </w:rPr>
-        <w:t>Layer</w:t>
-      </w:r>
-      <w:proofErr w:type="spellEnd"/>
-      <w:r>
-        <w:rPr>
-          <w:b/>
-          <w:bCs/>
-        </w:rPr>
-        <w:t>:</w:t>
-      </w:r>
-      <w:r>
-        <w:t xml:space="preserve"> Orkestreert scan-events en coördineert het uur-opslagproces.</w:t>
-      </w:r>
-    </w:p>
-    <w:p>
-      <w:pPr>
-        <w:numPr>
-          <w:ilvl w:val="0"/>
-          <w:numId w:val="3"/>
-        </w:numPr>
-      </w:pPr>
-      <w:r>
-        <w:rPr>
-          <w:b/>
-          <w:bCs/>
-        </w:rPr>
-        <w:t xml:space="preserve">Business Logic </w:t>
-      </w:r>
-      <w:proofErr w:type="spellStart"/>
-      <w:r>
-        <w:rPr>
-          <w:b/>
-          <w:bCs/>
-        </w:rPr>
-        <w:t>Layer</w:t>
-      </w:r>
-      <w:proofErr w:type="spellEnd"/>
-      <w:r>
-        <w:rPr>
-          <w:b/>
-          <w:bCs/>
-        </w:rPr>
-        <w:t>:</w:t>
-      </w:r>
-      <w:r>
-        <w:t xml:space="preserve"> Valideert scan-events en beheert de in-memory </w:t>
-      </w:r>
-      <w:proofErr w:type="spellStart"/>
-      <w:r>
-        <w:t>hour</w:t>
-      </w:r>
-      <w:proofErr w:type="spellEnd"/>
-      <w:r>
-        <w:t xml:space="preserve"> counter.</w:t>
-      </w:r>
-    </w:p>
-    <w:p>
-      <w:pPr>
-        <w:numPr>
-          <w:ilvl w:val="0"/>
-          <w:numId w:val="3"/>
-        </w:numPr>
-      </w:pPr>
-      <w:r>
-        <w:rPr>
-          <w:b/>
-          <w:bCs/>
-        </w:rPr>
-        <w:t xml:space="preserve">Data Access </w:t>
-      </w:r>
-      <w:proofErr w:type="spellStart"/>
-      <w:r>
-        <w:rPr>
-          <w:b/>
-          <w:bCs/>
-        </w:rPr>
-        <w:t>Layer</w:t>
-      </w:r>
-      <w:proofErr w:type="spellEnd"/>
-      <w:r>
-        <w:rPr>
-          <w:b/>
-          <w:bCs/>
-        </w:rPr>
-        <w:t>:</w:t>
-      </w:r>
-      <w:r>
-        <w:t xml:space="preserve"> Verzorgt de opslag van </w:t>
-      </w:r>
-      <w:proofErr w:type="spellStart"/>
-      <w:r>
-        <w:t>uurtotalen</w:t>
-      </w:r>
-      <w:proofErr w:type="spellEnd"/>
-      <w:r>
-        <w:t xml:space="preserve"> in de database.</w:t>
-      </w:r>
-    </w:p>
-    <w:p>
-      <w:pPr>
-        <w:numPr>
-          <w:ilvl w:val="0"/>
-          <w:numId w:val="3"/>
-        </w:numPr>
-      </w:pPr>
-      <w:r>
-        <w:rPr>
-          <w:b/>
-          <w:bCs/>
-        </w:rPr>
-        <w:t xml:space="preserve">Database </w:t>
-      </w:r>
-      <w:proofErr w:type="spellStart"/>
-      <w:r>
-        <w:rPr>
-          <w:b/>
-          <w:bCs/>
-        </w:rPr>
-        <w:t>Layer</w:t>
-      </w:r>
-      <w:proofErr w:type="spellEnd"/>
-      <w:r>
-        <w:rPr>
-          <w:b/>
-          <w:bCs/>
-        </w:rPr>
-        <w:t>:</w:t>
+        <w:t>Database Layer:</w:t>
       </w:r>
       <w:r>
         <w:t xml:space="preserve"> Zorgt voor persistente opslag van statistische gegevens.</w:t>
@@ -3348,34 +2709,9 @@
     </w:p>
     <w:p>
       <w:r>
-        <w:t xml:space="preserve">Door live communicatie via </w:t>
-      </w:r>
-      <w:proofErr w:type="spellStart"/>
-      <w:r>
-        <w:t>WebSockets</w:t>
-      </w:r>
-      <w:proofErr w:type="spellEnd"/>
-      <w:r>
-        <w:t xml:space="preserve"> te combineren met een in-memory </w:t>
-      </w:r>
-      <w:proofErr w:type="spellStart"/>
-      <w:r>
-        <w:t>hour</w:t>
-      </w:r>
-      <w:proofErr w:type="spellEnd"/>
-      <w:r>
-        <w:t xml:space="preserve"> counter en periodieke opslag van geaggregeerde data, ontstaat een schaalbare en efficiënte architectuur. Real-time functionaliteit en statistische verwerking zijn duidelijk van elkaar gescheiden, wat bijdraagt aan performance, </w:t>
-      </w:r>
-      <w:proofErr w:type="spellStart"/>
-      <w:r>
-        <w:t>onderhoudbaarheid</w:t>
-      </w:r>
-      <w:proofErr w:type="spellEnd"/>
-      <w:r>
-        <w:t xml:space="preserve"> en overzichtelijkheid binnen het systeem.</w:t>
-      </w:r>
-    </w:p>
-    <w:p/>
+        <w:t>Door live communicatie via WebSockets te combineren met een in-memory hour counter en periodieke opslag van geaggregeerde data, ontstaat een schaalbare en efficiënte architectuur. Real-time functionaliteit en statistische verwerking zijn duidelijk van elkaar gescheiden, wat bijdraagt aan performance, onderhoudbaarheid en overzichtelijkheid binnen het systeem.</w:t>
+      </w:r>
+    </w:p>
     <w:p>
       <w:pPr>
         <w:pStyle w:val="Kop2"/>
@@ -3385,165 +2721,146 @@
       <w:pPr>
         <w:pStyle w:val="Kop2"/>
       </w:pPr>
+      <w:r>
+        <w:t>Overig</w:t>
+      </w:r>
+      <w:bookmarkEnd w:id="20"/>
+    </w:p>
+    <w:p>
+      <w:r>
+        <w:t>Als er nog taken bij komen vanuit collega’s dan werk ik deze hier uit.</w:t>
+      </w:r>
+    </w:p>
+    <w:p/>
+    <w:p>
+      <w:pPr>
+        <w:pStyle w:val="Kop1"/>
+      </w:pPr>
+      <w:r>
+        <w:t>Uitwerkingen</w:t>
+      </w:r>
     </w:p>
     <w:p>
       <w:pPr>
         <w:pStyle w:val="Kop2"/>
       </w:pPr>
+      <w:r>
+        <w:t>Smart-Iot-Gateway-Scan moderniseren</w:t>
+      </w:r>
+    </w:p>
+    <w:p>
+      <w:r>
+        <w:t>Als allereerst heb ik de bestaande “brugscan” gekopieerd van de externe “Laird” router naar mijn eigen laptop, Om deze hier te kunnen bewerken. Hier heb ik nog is bekeken hoe ik het beste deze oplossing werkelijkheid kon maken. Aangezien deze scan live draait lag het gebruik van een externe database eigenlijk al uit de mogelijkheden, aangezien deze oplossing altijd een vorm van delay met zich meebrengt. Na een hoop nadenken en zoeken op internet heb ik bedacht om een websocket te maken om de data over het internet te versturen. Na een meeting ingepland te hebben met mijn collega’s en het concept uitgelegd te hebben van wat een websaocket is kreeg ik eigenlijk gelijk de “green light” om verder te gaan met mijn oplossing met de websocket. Al vrij snel heb ik uitgevogeld hoe ik een websocket server kon openen en verbinden op een andere PC. Dit heb ik gedaan en ook heel simpel gezegd dat hij alle data die rauw binnenkwam door te zetten op de websocket. Dit werkte, maar was lelijk en onleesbaar aan de front-end. Ik heb nog een aantal dagen gewerkt aan het formateren van de output die ik meestuur aan de websocket. Op dit punt zag het er allemaal al een stuk netter uit aan de front-end.</w:t>
+      </w:r>
+    </w:p>
+    <w:p>
+      <w:pPr>
+        <w:pStyle w:val="Kop3"/>
+      </w:pPr>
+      <w:r>
+        <w:t>Koppelen websocket aan website</w:t>
+      </w:r>
+    </w:p>
+    <w:p>
+      <w:r>
+        <w:t xml:space="preserve">Aangezien de output van de websocket er nu mooi uitzag moet ik deze gaan koppelen aan de front-end. Hiervoor heb ik een paar dagen besteed om een exacte clone te maken van de bestaande website. Vervolgens heb ik hieraan mijn websocket gekoppeld na nog een aantal dagen klooien. Uiteindelijk had ik op mijn eigen “dummy” website de websocket gekoppeld en werkend gekregen. Vervolgens hebben we binnen het bedrijf een meeting gehad of we mijn “dummy” website ook in de praktijk zouden gebruiken. Op dat moment is het besluiten om onze bestaande website in Wordpress te blijven gebruiken, aangezien de baas van het bedrijf niet echt kennis heeft van code en er op dit moment geen front-end developers in het bedrijf zijn. Dit betekende voor mij dat ik stukjes van mijn zelfgeschreven code wel kon blijven gebruiken, maar dat ik mijn oplossing moest gaan koppelen aan de bestaande Wordpress website. Toen ik dit probeerde merkte ik dat de website buiten ons netwerk gehost was en ik dus mijn oplossing niet kon verbinden aangezien deze het alleen in ons eigen netwerk bereikbaar zou zijn. Met dit probleem heb ik langere tijd gezeten en dag op dag zocht ik op internet </w:t>
+      </w:r>
+      <w:r>
+        <w:lastRenderedPageBreak/>
+        <w:t>naar oplossingen hiervoor. Na 3 dagen kwam ik op een site van Ngrok. Na even lezen hoe het werkt was dit precies wat ik nodig had. Deze oplossing werd gebruikt om lokale oplossingen tijdelijk of voor langere duur online te zetten en ze hadden ondersteuning voor websockets. Deze oplossing heb ik geïmplementeerd en getest en het werkte inderdaad precies zoals ik had gelezen dat het zou moeten werken. Ik heb de URL die ik van Ngrok kreeg gekoppeld aan onze site en het werkte inderdaad.</w:t>
+      </w:r>
     </w:p>
     <w:p>
       <w:pPr>
         <w:pStyle w:val="Kop2"/>
       </w:pPr>
-    </w:p>
-    <w:p>
-      <w:pPr>
-        <w:pStyle w:val="Kop2"/>
-      </w:pPr>
-    </w:p>
-    <w:p>
-      <w:pPr>
-        <w:pStyle w:val="Kop2"/>
-      </w:pPr>
-    </w:p>
-    <w:p>
-      <w:pPr>
-        <w:pStyle w:val="Kop2"/>
-      </w:pPr>
-    </w:p>
-    <w:p>
-      <w:pPr>
-        <w:pStyle w:val="Kop2"/>
-      </w:pPr>
-    </w:p>
-    <w:p>
-      <w:pPr>
-        <w:pStyle w:val="Kop2"/>
-      </w:pPr>
-    </w:p>
-    <w:p>
-      <w:pPr>
-        <w:pStyle w:val="Kop2"/>
-      </w:pPr>
-    </w:p>
-    <w:p>
-      <w:pPr>
-        <w:pStyle w:val="Kop2"/>
-      </w:pPr>
-    </w:p>
-    <w:p>
-      <w:pPr>
-        <w:pStyle w:val="Kop2"/>
-      </w:pPr>
-    </w:p>
-    <w:p>
-      <w:pPr>
-        <w:pStyle w:val="Kop2"/>
-      </w:pPr>
-    </w:p>
-    <w:p>
-      <w:pPr>
-        <w:pStyle w:val="Kop2"/>
-      </w:pPr>
-    </w:p>
-    <w:p>
-      <w:pPr>
-        <w:pStyle w:val="Kop2"/>
-      </w:pPr>
-    </w:p>
-    <w:p>
-      <w:pPr>
-        <w:pStyle w:val="Kop2"/>
-      </w:pPr>
-    </w:p>
-    <w:p>
-      <w:pPr>
-        <w:pStyle w:val="Kop2"/>
-      </w:pPr>
-    </w:p>
-    <w:p>
-      <w:pPr>
-        <w:pStyle w:val="Kop2"/>
-      </w:pPr>
-    </w:p>
-    <w:p>
-      <w:pPr>
-        <w:pStyle w:val="Kop2"/>
-      </w:pPr>
-    </w:p>
-    <w:p>
-      <w:pPr>
-        <w:pStyle w:val="Kop2"/>
-      </w:pPr>
-    </w:p>
-    <w:p>
-      <w:pPr>
-        <w:pStyle w:val="Kop2"/>
-      </w:pPr>
-    </w:p>
-    <w:p>
-      <w:pPr>
-        <w:pStyle w:val="Kop2"/>
-      </w:pPr>
-    </w:p>
-    <w:p>
-      <w:pPr>
-        <w:pStyle w:val="Kop2"/>
-      </w:pPr>
-    </w:p>
-    <w:p>
-      <w:pPr>
-        <w:pStyle w:val="Kop2"/>
-      </w:pPr>
+      <w:r>
+        <w:t>Front-end</w:t>
+      </w:r>
+    </w:p>
+    <w:p>
+      <w:r>
+        <w:t>Mij is gezegd dat ze de scan er exact uit wilden laten zien zoals de oplossing via Twitch die ze hadden draaien, alleen dan zonder Twitch. Dit heb ik gemaakt binnen Wordpress, maar ook mijn eigen “dummy” website.</w:t>
+      </w:r>
+    </w:p>
+    <w:p>
+      <w:pPr>
+        <w:pStyle w:val="Kop3"/>
+      </w:pPr>
+      <w:r>
+        <w:t>Fullscreen knop</w:t>
+      </w:r>
+    </w:p>
+    <w:p>
+      <w:r>
+        <w:t>Uiteindelijk kreeg ik de vraag van mijn bedrijfsbegeleider of ik een fullscreen knop kon maken om de scan op vol scherm te bekijken. Hier heb ik ja op gezegd in de veronderstelling dat dit wel een makkelijk probleem zou zijn en dat er vast wel een oplossing ingebakken zou zitten binnen Wordpress, alleen na veel zoeken bleek deze oplossing niet te bestaan, dus ben ik maar naar oplossingen gaan zoeken die ik kon implementeren met code. Dus de volgende dag ben ik begonnen met het zoeken naar oplossingen en kleine aanpassingen maken voor mijn eigen use-case, maar keer op keer ging er iets mis binnen deze oplossingen, dus ben ik zelf oplossingen gaan maken om deze te testen, maar niks wou werken. Uiteindelijk is er tegen mij gezegd om er een nachtje over te slapen en om het de volgende dag opnieuw te proberen, dus dit heb ik dan ook gedaan. De volgende dag ben ik gelijk begonnen met het kijken naar oplossingen die zouden werken met wat ik had gemaakt en toen ben ik erachter gekomen dat er al een API bestond voor het maken van een fullscreen knop. Hier heb ik een oplossing mee gemaakt en dit werkte in 1 keer.</w:t>
+      </w:r>
+    </w:p>
+    <w:p>
+      <w:pPr>
+        <w:pStyle w:val="Kop1"/>
+      </w:pPr>
+      <w:r>
+        <w:t>Grafiek Smart-IoT-Gateway-Scan</w:t>
+      </w:r>
+    </w:p>
+    <w:p>
+      <w:r>
+        <w:t>Om dit te maken ben ik begonnen met het maken van een simpele versie die elke minuut weergeeft b innen de websocket hoeveel unieke apparaten er zijn gevonden. Dit heb ik geïmplementeerd en het bleek inderdaad dat dit goed ging. Vervolgens wou mijn baas dat ik ook laat zijn watvoor nieuwe devices er dan zijn gescand, dus heb ik een oplossing gemaakt die bij dezelfde broadcast naar de websocket weergeeft hoeveel apparaten van watvoor bedrijf er dan zijn gevonden</w:t>
+      </w:r>
+    </w:p>
+    <w:p>
       <w:r>
         <w:lastRenderedPageBreak/>
-        <w:t>Overig</w:t>
-      </w:r>
-      <w:bookmarkEnd w:id="20"/>
-    </w:p>
-    <w:p>
-      <w:r>
-        <w:t>Als er nog taken bij komen vanuit collega’s dan werk ik deze hier uit.</w:t>
-      </w:r>
-    </w:p>
-    <w:p>
-      <w:r>
-        <w:t xml:space="preserve">Ik ben erachter gekomen dat onze website extern wordt gehost en we dus zelf niet in het netwerk kunnen komen om de gemaakte prototype van de scan in de </w:t>
-      </w:r>
-      <w:proofErr w:type="spellStart"/>
-      <w:r>
-        <w:t>websocket</w:t>
-      </w:r>
-      <w:proofErr w:type="spellEnd"/>
-      <w:r>
-        <w:t xml:space="preserve"> te tonen op de website. Ik heb na aanleiding van dit probleem gebeld met 1 van de andere </w:t>
-      </w:r>
-      <w:proofErr w:type="spellStart"/>
-      <w:r>
-        <w:t>developers</w:t>
-      </w:r>
-      <w:proofErr w:type="spellEnd"/>
-      <w:r>
-        <w:t xml:space="preserve"> en voorgesteld om poorten te openen, maar dit was geen goed idee volgens die andere </w:t>
-      </w:r>
-      <w:proofErr w:type="spellStart"/>
-      <w:r>
-        <w:t>developer</w:t>
-      </w:r>
-      <w:proofErr w:type="spellEnd"/>
-      <w:r>
-        <w:t xml:space="preserve">. Samen hebben we bedacht dat ik een mail zou sturen naar het bedrijf waar de website gehost wordt om te vragen of het mogelijk is om de server voor onze website in een VPN of iets dergelijks te zetten, zodat we van buitenaf het netwerk van de website in kunnen. </w:t>
-      </w:r>
-    </w:p>
+        <w:drawing>
+          <wp:inline distT="0" distB="0" distL="0" distR="0" wp14:anchorId="2CC44094" wp14:editId="7FEE30D3">
+            <wp:extent cx="4153480" cy="2953162"/>
+            <wp:effectExtent l="0" t="0" r="0" b="0"/>
+            <wp:docPr id="143851458" name="Afbeelding 1"/>
+            <wp:cNvGraphicFramePr>
+              <a:graphicFrameLocks xmlns:a="http://schemas.openxmlformats.org/drawingml/2006/main" noChangeAspect="1"/>
+            </wp:cNvGraphicFramePr>
+            <a:graphic xmlns:a="http://schemas.openxmlformats.org/drawingml/2006/main">
+              <a:graphicData uri="http://schemas.openxmlformats.org/drawingml/2006/picture">
+                <pic:pic xmlns:pic="http://schemas.openxmlformats.org/drawingml/2006/picture">
+                  <pic:nvPicPr>
+                    <pic:cNvPr id="143851458" name=""/>
+                    <pic:cNvPicPr/>
+                  </pic:nvPicPr>
+                  <pic:blipFill>
+                    <a:blip r:embed="rId14"/>
+                    <a:stretch>
+                      <a:fillRect/>
+                    </a:stretch>
+                  </pic:blipFill>
+                  <pic:spPr>
+                    <a:xfrm>
+                      <a:off x="0" y="0"/>
+                      <a:ext cx="4153480" cy="2953162"/>
+                    </a:xfrm>
+                    <a:prstGeom prst="rect">
+                      <a:avLst/>
+                    </a:prstGeom>
+                  </pic:spPr>
+                </pic:pic>
+              </a:graphicData>
+            </a:graphic>
+          </wp:inline>
+        </w:drawing>
+      </w:r>
+    </w:p>
+    <w:p/>
+    <w:p/>
+    <w:p/>
     <w:p/>
     <w:p/>
     <w:sectPr>
-      <w:headerReference w:type="even" r:id="rId14"/>
-      <w:headerReference w:type="default" r:id="rId15"/>
-      <w:footerReference w:type="even" r:id="rId16"/>
-      <w:footerReference w:type="default" r:id="rId17"/>
-      <w:headerReference w:type="first" r:id="rId18"/>
-      <w:footerReference w:type="first" r:id="rId19"/>
+      <w:headerReference w:type="even" r:id="rId15"/>
+      <w:headerReference w:type="default" r:id="rId16"/>
+      <w:footerReference w:type="even" r:id="rId17"/>
+      <w:footerReference w:type="default" r:id="rId18"/>
+      <w:headerReference w:type="first" r:id="rId19"/>
+      <w:footerReference w:type="first" r:id="rId20"/>
       <w:pgSz w:w="11906" w:h="16838"/>
       <w:pgMar w:top="1417" w:right="1417" w:bottom="1417" w:left="1417" w:header="708" w:footer="708" w:gutter="0"/>
       <w:cols w:space="708"/>

</xml_diff>